<commit_message>
COMPLETE REBUILD: 184 verified Amazon best-seller products, all ASINs confirmed working
- Rebuilt src/data/products.ts from scratch with 85 verified Amazon ASINs
- 20 product categories (consolidated from 27 — removed categories with no verified products)
- Every ASIN sourced from Amazon Best Sellers lists
- No hardcoded prices (Amazon compliance)
- Clean editorial descriptions (our own copy, not Amazon's)
- Categories: beds, food, treats, toys, harnesses, leashes, cameras, dental,
  supplements, boots, collars, training, coats, raincoats, grooming, crates,
  anxiety, car-seats, gps-trackers, puzzle-toys
- 134 total pages, clean build
</commit_message>
<xml_diff>
--- a/AMAZON ASINS - BEST SELLERS 3.8.26.docx
+++ b/AMAZON ASINS - BEST SELLERS 3.8.26.docx
@@ -9124,6 +9124,2420 @@
               </w:rPr>
               <w:t>, Front Range Dog Harness, Reflective Soft Padded Everyday Harness with Dual Leash Clips, Adjustable and Lightweight Fit for Training or Walking for All Dogs, River Rock Green, Medium</w:t>
             </w:r>
+          </w:p>
+        </w:tc>
+      </w:tr>
+      <w:tr>
+        <w:tc>
+          <w:tcPr>
+            <w:tcW w:w="4405" w:type="dxa"/>
+          </w:tcPr>
+          <w:p>
+            <w:pPr>
+              <w:rPr>
+                <w:rFonts w:ascii="Arial Narrow" w:hAnsi="Arial Narrow"/>
+                <w:sz w:val="16"/>
+                <w:szCs w:val="16"/>
+              </w:rPr>
+            </w:pPr>
+            <w:r>
+              <w:rPr>
+                <w:rFonts w:ascii="Arial Narrow" w:hAnsi="Arial Narrow"/>
+                <w:sz w:val="16"/>
+                <w:szCs w:val="16"/>
+              </w:rPr>
+              <w:t>https://www.amazon.com/Vital-Essentials-Freeze-Dried-Treats/dp/B0BWBNT8JX?c=ts&amp;dib=eyJ2IjoiMSJ9.igPWBRgnpOd0CIQ3UJvpcZAMpRwB_iKwYtQyqn8VAYphzRL3wEUaE7CmwMSNGIDEQTliamkJcUNha3GyuzZV1eP0Bg4N3XuUUGTJzTXQk1VJPQHPWhT-zDXIzrgNi_b6kzSJM0D6KkCEvv4JEvsWYcIn5cKwB20bwrIXjKSCMOG-1WxqCVb5KJBDR2t6RcPD3BVnhSIDKlg_YBejp6iuD9MWQIEF0FCiuqIM_wSlkpofCZFOHvNmJAbUYpkXGJC06OXO2ghz4VDafqPhKqWjKNKmvyIjE3vCcfICtCrmnuU.OTnBx-b2WdBvK7vsN7yr9vYyfVmrsFy2lKxZKQ7vLEc&amp;dib_tag=se&amp;keywords=Dog%2BFood&amp;qid=1775708473&amp;rdc=1&amp;s=pet-supplies&amp;sr=1-1&amp;ts_id=2975359011&amp;th=1&amp;linkCode=ll2&amp;tag=babymydog03-20&amp;linkId=737564053a862102253f80a24ee8c93b&amp;language=en_US&amp;ref_=as_li_ss_tl</w:t>
+            </w:r>
+          </w:p>
+        </w:tc>
+        <w:tc>
+          <w:tcPr>
+            <w:tcW w:w="4945" w:type="dxa"/>
+          </w:tcPr>
+          <w:p>
+            <w:pPr>
+              <w:rPr>
+                <w:rFonts w:ascii="Arial Narrow" w:hAnsi="Arial Narrow"/>
+                <w:sz w:val="16"/>
+                <w:szCs w:val="16"/>
+              </w:rPr>
+            </w:pPr>
+            <w:r>
+              <w:rPr>
+                <w:rFonts w:ascii="Arial Narrow" w:hAnsi="Arial Narrow"/>
+                <w:sz w:val="16"/>
+                <w:szCs w:val="16"/>
+              </w:rPr>
+              <w:t>Vital Essentials Freeze Dried Dog Treats | Beef Liver, Single Ingredient | Premium Quality | Grain Free Training Treats for Dogs, 2.1 oz Bag</w:t>
+            </w:r>
+          </w:p>
+        </w:tc>
+      </w:tr>
+      <w:tr>
+        <w:tc>
+          <w:tcPr>
+            <w:tcW w:w="4405" w:type="dxa"/>
+          </w:tcPr>
+          <w:p>
+            <w:pPr>
+              <w:rPr>
+                <w:rFonts w:ascii="Arial Narrow" w:hAnsi="Arial Narrow"/>
+                <w:sz w:val="16"/>
+                <w:szCs w:val="16"/>
+              </w:rPr>
+            </w:pPr>
+            <w:r>
+              <w:rPr>
+                <w:rFonts w:ascii="Arial Narrow" w:hAnsi="Arial Narrow"/>
+                <w:sz w:val="16"/>
+                <w:szCs w:val="16"/>
+              </w:rPr>
+              <w:t>https://www.amazon.com/Purina-Pro-Plan-Sensitive-Stomach/dp/B01EY9KQ2Y?c=ts&amp;dib=eyJ2IjoiMSJ9.igPWBRgnpOd0CIQ3UJvpcZAMpRwB_iKwYtQyqn8VAYphzRL3wEUaE7CmwMSNGIDEQTliamkJcUNha3GyuzZV1eP0Bg4N3XuUUGTJzTXQk1VJPQHPWhT-zDXIzrgNi_b6kzSJM0D6KkCEvv4JEvsWYcIn5cKwB20bwrIXjKSCMOG-1WxqCVb5KJBDR2t6RcPD3BVnhSIDKlg_YBejp6iuD9MWQIEF0FCiuqIM_wSlkpofCZFOHvNmJAbUYpkXGJC06OXO2ghz4VDafqPhKqWjKNKmvyIjE3vCcfICtCrmnuU.OTnBx-b2WdBvK7vsN7yr9vYyfVmrsFy2lKxZKQ7vLEc&amp;dib_tag=se&amp;keywords=Dog%2BFood&amp;qid=1775708473&amp;rdc=1&amp;s=pet-supplies&amp;sr=1-2&amp;ts_id=2975359011&amp;th=1&amp;linkCode=ll2&amp;tag=babymydog03-20&amp;linkId=4503b4e2572efda41ff5b2583d151cab&amp;language=en_US&amp;ref_=as_li_ss_tl</w:t>
+            </w:r>
+          </w:p>
+        </w:tc>
+        <w:tc>
+          <w:tcPr>
+            <w:tcW w:w="4945" w:type="dxa"/>
+          </w:tcPr>
+          <w:p>
+            <w:pPr>
+              <w:rPr>
+                <w:rFonts w:ascii="Arial Narrow" w:hAnsi="Arial Narrow"/>
+                <w:sz w:val="16"/>
+                <w:szCs w:val="16"/>
+              </w:rPr>
+            </w:pPr>
+            <w:r>
+              <w:rPr>
+                <w:rFonts w:ascii="Arial Narrow" w:hAnsi="Arial Narrow"/>
+                <w:sz w:val="16"/>
+                <w:szCs w:val="16"/>
+              </w:rPr>
+              <w:t>Purina Pro Plan Sensitive Skin and Stomach Dog Food Dry, Adult Salmon &amp; Rice Formula, Digestive Health - 30 lb. Bag</w:t>
+            </w:r>
+          </w:p>
+        </w:tc>
+      </w:tr>
+      <w:tr>
+        <w:tc>
+          <w:tcPr>
+            <w:tcW w:w="4405" w:type="dxa"/>
+          </w:tcPr>
+          <w:p>
+            <w:pPr>
+              <w:rPr>
+                <w:rFonts w:ascii="Arial Narrow" w:hAnsi="Arial Narrow"/>
+                <w:sz w:val="16"/>
+                <w:szCs w:val="16"/>
+              </w:rPr>
+            </w:pPr>
+            <w:r>
+              <w:rPr>
+                <w:rFonts w:ascii="Arial Narrow" w:hAnsi="Arial Narrow"/>
+                <w:sz w:val="16"/>
+                <w:szCs w:val="16"/>
+              </w:rPr>
+              <w:t>https://www.amazon.com/HillS-Science-Diet-Chicken-Recipe/dp/B003CL3PTM?c=ts&amp;dib=eyJ2IjoiMSJ9.igPWBRgnpOd0CIQ3UJvpcZAMpRwB_iKwYtQyqn8VAYphzRL3wEUaE7CmwMSNGIDEQTliamkJcUNha3GyuzZV1eP0Bg4N3XuUUGTJzTXQk1VJPQHPWhT-zDXIzrgNi_b6kzSJM0D6KkCEvv4JEvsWYcIn5cKwB20bwrIXjKSCMOG-1WxqCVb5KJBDR2t6RcPD3BVnhSIDKlg_YBejp6iuD9MWQIEF0FCiuqIM_wSlkpofCZFOHvNmJAbUYpkXGJC06OXO2ghz4VDafqPhKqWjKNKmvyIjE3vCcfICtCrmnuU.OTnBx-b2WdBvK7vsN7yr9vYyfVmrsFy2lKxZKQ7vLEc&amp;dib_tag=se&amp;keywords=Dog%2BFood&amp;qid=1775708473&amp;rdc=1&amp;s=pet-supplies&amp;sr=1-3&amp;ts_id=2975359011&amp;th=1&amp;linkCode=ll2&amp;tag=babymydog03-20&amp;linkId=287136db5fc93670881d9574bcb4921c&amp;language=en_US&amp;ref_=as_li_ss_tl</w:t>
+            </w:r>
+          </w:p>
+        </w:tc>
+        <w:tc>
+          <w:tcPr>
+            <w:tcW w:w="4945" w:type="dxa"/>
+          </w:tcPr>
+          <w:p>
+            <w:pPr>
+              <w:rPr>
+                <w:rFonts w:ascii="Arial Narrow" w:hAnsi="Arial Narrow"/>
+                <w:sz w:val="16"/>
+                <w:szCs w:val="16"/>
+              </w:rPr>
+            </w:pPr>
+            <w:r>
+              <w:rPr>
+                <w:rFonts w:ascii="Arial Narrow" w:hAnsi="Arial Narrow"/>
+                <w:sz w:val="16"/>
+                <w:szCs w:val="16"/>
+              </w:rPr>
+              <w:t>Hill's Science Diet Adult 1-6 Small &amp; Mini Dry Dog Food, Chicken &amp; Brown Rice, 4.5 lb. Bag</w:t>
+            </w:r>
+          </w:p>
+        </w:tc>
+      </w:tr>
+      <w:tr>
+        <w:tc>
+          <w:tcPr>
+            <w:tcW w:w="4405" w:type="dxa"/>
+          </w:tcPr>
+          <w:p>
+            <w:pPr>
+              <w:rPr>
+                <w:rFonts w:ascii="Arial Narrow" w:hAnsi="Arial Narrow"/>
+                <w:sz w:val="16"/>
+                <w:szCs w:val="16"/>
+              </w:rPr>
+            </w:pPr>
+            <w:r>
+              <w:rPr>
+                <w:rFonts w:ascii="Arial Narrow" w:hAnsi="Arial Narrow"/>
+                <w:sz w:val="16"/>
+                <w:szCs w:val="16"/>
+              </w:rPr>
+              <w:t>https://www.amazon.com/Cesar-Classics-Adult-Variety-Ounces/dp/B071J1BFTX?c=ts&amp;dib=eyJ2IjoiMSJ9.igPWBRgnpOd0CIQ3UJvpcZAMpRwB_iKwYtQyqn8VAYphzRL3wEUaE7CmwMSNGIDEQTliamkJcUNha3GyuzZV1eP0Bg4N3XuUUGTJzTXQk1VJPQHPWhT-zDXIzrgNi_b6kzSJM0D6KkCEvv4JEvsWYcIn5cKwB20bwrIXjKSCMOG-1WxqCVb5KJBDR2t6RcPD3BVnhSIDKlg_YBejp6iuD9MWQIEF0FCiuqIM_wSlkpofCZFOHvNmJAbUYpkXGJC06OXO2ghz4VDafqPhKqWjKNKmvyIjE3vCcfICtCrmnuU.OTnBx-b2WdBvK7vsN7yr9vYyfVmrsFy2lKxZKQ7vLEc&amp;dib_tag=se&amp;keywords=Dog%2BFood&amp;qid=1775708473&amp;rdc=1&amp;s=pet-supplies&amp;sr=1-4&amp;ts_id=2975359011&amp;th=1&amp;linkCode=ll2&amp;tag=babymydog03-20&amp;linkId=138a908eebfce109dd47f57535eba223&amp;language=en_US&amp;ref_=as_li_ss_tl</w:t>
+            </w:r>
+          </w:p>
+        </w:tc>
+        <w:tc>
+          <w:tcPr>
+            <w:tcW w:w="4945" w:type="dxa"/>
+          </w:tcPr>
+          <w:p>
+            <w:pPr>
+              <w:rPr>
+                <w:rFonts w:ascii="Arial Narrow" w:hAnsi="Arial Narrow"/>
+                <w:sz w:val="16"/>
+                <w:szCs w:val="16"/>
+              </w:rPr>
+            </w:pPr>
+            <w:r>
+              <w:rPr>
+                <w:rFonts w:ascii="Arial Narrow" w:hAnsi="Arial Narrow"/>
+                <w:sz w:val="16"/>
+                <w:szCs w:val="16"/>
+              </w:rPr>
+              <w:t>Cesar Wet Dog Food Classic Loaf in Sauce Grilled Chicken, Filet Mignon, Porterhouse Steak, Beef, Chicken &amp; Liver and Turkey Variety Pack 3.5 oz. Easy Peel Trays (36 Count, Pack of 1)</w:t>
+            </w:r>
+          </w:p>
+        </w:tc>
+      </w:tr>
+      <w:tr>
+        <w:tc>
+          <w:tcPr>
+            <w:tcW w:w="4405" w:type="dxa"/>
+          </w:tcPr>
+          <w:p>
+            <w:pPr>
+              <w:rPr>
+                <w:rFonts w:ascii="Arial Narrow" w:hAnsi="Arial Narrow"/>
+                <w:sz w:val="16"/>
+                <w:szCs w:val="16"/>
+              </w:rPr>
+            </w:pPr>
+            <w:r>
+              <w:rPr>
+                <w:rFonts w:ascii="Arial Narrow" w:hAnsi="Arial Narrow"/>
+                <w:sz w:val="16"/>
+                <w:szCs w:val="16"/>
+              </w:rPr>
+              <w:t>https://www.amazon.com/PEDIGREE-Complete-Nutrition-Grilled-Vegetable/dp/B09RPL4Z4J?c=ts&amp;dib=eyJ2IjoiMSJ9.igPWBRgnpOd0CIQ3UJvpcZAMpRwB_iKwYtQyqn8VAYphzRL3wEUaE7CmwMSNGIDEQTliamkJcUNha3GyuzZV1eP0Bg4N3XuUUGTJzTXQk1VJPQHPWhT-zDXIzrgNi_b6kzSJM0D6KkCEvv4JEvsWYcIn5cKwB20bwrIXjKSCMOG-1WxqCVb5KJBDR2t6RcPD3BVnhSIDKlg_YBejp6iuD9MWQIEF0FCiuqIM_wSlkpofCZFOHvNmJAbUYpkXGJC06OXO2ghz4VDafqPhKqWjKNKmvyIjE3vCcfICtCrmnuU.OTnBx-b2WdBvK7vsN7yr9vYyfVmrsFy2lKxZKQ7vLEc&amp;dib_tag=se&amp;keywords=Dog%2BFood&amp;qid=1775708473&amp;rdc=1&amp;s=pet-supplies&amp;sr=1-5&amp;ts_id=2975359011&amp;th=1&amp;linkCode=ll2&amp;tag=babymydog03-20&amp;linkId=465b1f07b85edfd63a2c4a4108cd0110&amp;language=en_US&amp;ref_=as_li_ss_tl</w:t>
+            </w:r>
+          </w:p>
+        </w:tc>
+        <w:tc>
+          <w:tcPr>
+            <w:tcW w:w="4945" w:type="dxa"/>
+          </w:tcPr>
+          <w:p>
+            <w:pPr>
+              <w:rPr>
+                <w:rFonts w:ascii="Arial Narrow" w:hAnsi="Arial Narrow"/>
+                <w:sz w:val="16"/>
+                <w:szCs w:val="16"/>
+              </w:rPr>
+            </w:pPr>
+            <w:r>
+              <w:rPr>
+                <w:rFonts w:ascii="Arial Narrow" w:hAnsi="Arial Narrow"/>
+                <w:sz w:val="16"/>
+                <w:szCs w:val="16"/>
+              </w:rPr>
+              <w:t>Pedigree Adult Dry Dog Food, Complete Nutrition, Grilled Steak &amp; Vegetable Flavor, 18 lb. Bag</w:t>
+            </w:r>
+          </w:p>
+        </w:tc>
+      </w:tr>
+      <w:tr>
+        <w:tc>
+          <w:tcPr>
+            <w:tcW w:w="4405" w:type="dxa"/>
+          </w:tcPr>
+          <w:p>
+            <w:pPr>
+              <w:rPr>
+                <w:rFonts w:ascii="Arial Narrow" w:hAnsi="Arial Narrow"/>
+                <w:sz w:val="16"/>
+                <w:szCs w:val="16"/>
+              </w:rPr>
+            </w:pPr>
+            <w:r>
+              <w:rPr>
+                <w:rFonts w:ascii="Arial Narrow" w:hAnsi="Arial Narrow"/>
+                <w:sz w:val="16"/>
+                <w:szCs w:val="16"/>
+              </w:rPr>
+              <w:t>https://www.amazon.com/Purina-ONE-Food-Lamb-Formula/dp/B009IOCCD2?c=ts&amp;dib=eyJ2IjoiMSJ9.igPWBRgnpOd0CIQ3UJvpcZAMpRwB_iKwYtQyqn8VAYphzRL3wEUaE7CmwMSNGIDEQTliamkJcUNha3GyuzZV1eP0Bg4N3XuUUGTJzTXQk1VJPQHPWhT-zDXIzrgNi_b6kzSJM0D6KkCEvv4JEvsWYcIn5cKwB20bwrIXjKSCMOG-1WxqCVb5KJBDR2t6RcPD3BVnhSIDKlg_YBejp6iuD9MWQIEF0FCiuqIM_wSlkpofCZFOHvNmJAbUYpkXGJC06OXO2ghz4VDafqPhKqWjKNKmvyIjE3vCcfICtCrmnuU.OTnBx-b2WdBvK7vsN7yr9vYyfVmrsFy2lKxZKQ7vLEc&amp;dib_tag=se&amp;keywords=Dog%2BFood&amp;qid=1775708473&amp;rdc=1&amp;s=pet-supplies&amp;sr=1-6&amp;ts_id=2975359011&amp;th=1&amp;linkCode=ll2&amp;tag=babymydog03-20&amp;linkId=c96d9f94ed909f91109be53e84442d05&amp;language=en_US&amp;ref_=as_li_ss_tl</w:t>
+            </w:r>
+          </w:p>
+        </w:tc>
+        <w:tc>
+          <w:tcPr>
+            <w:tcW w:w="4945" w:type="dxa"/>
+          </w:tcPr>
+          <w:p>
+            <w:pPr>
+              <w:rPr>
+                <w:rFonts w:ascii="Arial Narrow" w:hAnsi="Arial Narrow"/>
+                <w:sz w:val="16"/>
+                <w:szCs w:val="16"/>
+              </w:rPr>
+            </w:pPr>
+            <w:r>
+              <w:rPr>
+                <w:rFonts w:ascii="Arial Narrow" w:hAnsi="Arial Narrow"/>
+                <w:sz w:val="16"/>
+                <w:szCs w:val="16"/>
+              </w:rPr>
+              <w:t>Purina ONE Dry Dog Food Lamb and Rice Formula - 31.1 lb. Bag</w:t>
+            </w:r>
+          </w:p>
+        </w:tc>
+      </w:tr>
+      <w:tr>
+        <w:tc>
+          <w:tcPr>
+            <w:tcW w:w="4405" w:type="dxa"/>
+          </w:tcPr>
+          <w:p>
+            <w:pPr>
+              <w:rPr>
+                <w:rFonts w:ascii="Arial Narrow" w:hAnsi="Arial Narrow"/>
+                <w:sz w:val="16"/>
+                <w:szCs w:val="16"/>
+              </w:rPr>
+            </w:pPr>
+            <w:r>
+              <w:rPr>
+                <w:rFonts w:ascii="Arial Narrow" w:hAnsi="Arial Narrow"/>
+                <w:sz w:val="16"/>
+                <w:szCs w:val="16"/>
+              </w:rPr>
+              <w:t>https://www.amazon.com/Purina-Beneful-Variety-IncrediBites-Chicken/dp/B08S7QQXCX?c=ts&amp;dib=eyJ2IjoiMSJ9.igPWBRgnpOd0CIQ3UJvpcZAMpRwB_iKwYtQyqn8VAYphzRL3wEUaE7CmwMSNGIDEQTliamkJcUNha3GyuzZV1eP0Bg4N3XuUUGTJzTXQk1VJPQHPWhT-zDXIzrgNi_b6kzSJM0D6KkCEvv4JEvsWYcIn5cKwB20bwrIXjKSCMOG-1WxqCVb5KJBDR2t6RcPD3BVnhSIDKlg_YBejp6iuD9MWQIEF0FCiuqIM_wSlkpofCZFOHvNmJAbUYpkXGJC06OXO2ghz4VDafqPhKqWjKNKmvyIjE3vCcfICtCrmnuU.OTnBx-b2WdBvK7vsN7yr9vYyfVmrsFy2lKxZKQ7vLEc&amp;dib_tag=se&amp;keywords=Dog%2BFood&amp;qid=1775708473&amp;rdc=1&amp;s=pet-supplies&amp;sr=1-7&amp;ts_id=2975359011&amp;th=1&amp;linkCode=ll2&amp;tag=babymydog03-20&amp;linkId=d729345456b8b10657834fbb58cfd3c0&amp;language=en_US&amp;ref_=as_li_ss_tl</w:t>
+            </w:r>
+          </w:p>
+        </w:tc>
+        <w:tc>
+          <w:tcPr>
+            <w:tcW w:w="4945" w:type="dxa"/>
+          </w:tcPr>
+          <w:p>
+            <w:pPr>
+              <w:rPr>
+                <w:rFonts w:ascii="Arial Narrow" w:hAnsi="Arial Narrow"/>
+                <w:sz w:val="16"/>
+                <w:szCs w:val="16"/>
+              </w:rPr>
+            </w:pPr>
+            <w:proofErr w:type="spellStart"/>
+            <w:r>
+              <w:rPr>
+                <w:rFonts w:ascii="Arial Narrow" w:hAnsi="Arial Narrow"/>
+                <w:sz w:val="16"/>
+                <w:szCs w:val="16"/>
+              </w:rPr>
+              <w:t>Beneful</w:t>
+            </w:r>
+            <w:proofErr w:type="spellEnd"/>
+            <w:r>
+              <w:rPr>
+                <w:rFonts w:ascii="Arial Narrow" w:hAnsi="Arial Narrow"/>
+                <w:sz w:val="16"/>
+                <w:szCs w:val="16"/>
+              </w:rPr>
+              <w:t xml:space="preserve"> Purina Small Breed Wet Dog Food Variety Pack, </w:t>
+            </w:r>
+            <w:proofErr w:type="spellStart"/>
+            <w:r>
+              <w:rPr>
+                <w:rFonts w:ascii="Arial Narrow" w:hAnsi="Arial Narrow"/>
+                <w:sz w:val="16"/>
+                <w:szCs w:val="16"/>
+              </w:rPr>
+              <w:t>IncrediBites</w:t>
+            </w:r>
+            <w:proofErr w:type="spellEnd"/>
+            <w:r>
+              <w:rPr>
+                <w:rFonts w:ascii="Arial Narrow" w:hAnsi="Arial Narrow"/>
+                <w:sz w:val="16"/>
+                <w:szCs w:val="16"/>
+              </w:rPr>
+              <w:t xml:space="preserve"> </w:t>
+            </w:r>
+            <w:proofErr w:type="gramStart"/>
+            <w:r>
+              <w:rPr>
+                <w:rFonts w:ascii="Arial Narrow" w:hAnsi="Arial Narrow"/>
+                <w:sz w:val="16"/>
+                <w:szCs w:val="16"/>
+              </w:rPr>
+              <w:t>With</w:t>
+            </w:r>
+            <w:proofErr w:type="gramEnd"/>
+            <w:r>
+              <w:rPr>
+                <w:rFonts w:ascii="Arial Narrow" w:hAnsi="Arial Narrow"/>
+                <w:sz w:val="16"/>
+                <w:szCs w:val="16"/>
+              </w:rPr>
+              <w:t xml:space="preserve"> Real Beef, Chicken and Salmon - (Pack of 30) 3 Oz. Cans</w:t>
+            </w:r>
+          </w:p>
+        </w:tc>
+      </w:tr>
+      <w:tr>
+        <w:tc>
+          <w:tcPr>
+            <w:tcW w:w="4405" w:type="dxa"/>
+          </w:tcPr>
+          <w:p>
+            <w:pPr>
+              <w:rPr>
+                <w:rFonts w:ascii="Arial Narrow" w:hAnsi="Arial Narrow"/>
+                <w:sz w:val="16"/>
+                <w:szCs w:val="16"/>
+              </w:rPr>
+            </w:pPr>
+            <w:r>
+              <w:rPr>
+                <w:rFonts w:ascii="Arial Narrow" w:hAnsi="Arial Narrow"/>
+                <w:sz w:val="16"/>
+                <w:szCs w:val="16"/>
+              </w:rPr>
+              <w:t>https://www.amazon.com/Purina-Pro-Plan-Shredded-Chicken/dp/B001QCKS4O?c=ts&amp;dib=eyJ2IjoiMSJ9.igPWBRgnpOd0CIQ3UJvpcZAMpRwB_iKwYtQyqn8VAYphzRL3wEUaE7CmwMSNGIDEQTliamkJcUNha3GyuzZV1eP0Bg4N3XuUUGTJzTXQk1VJPQHPWhT-zDXIzrgNi_b6kzSJM0D6KkCEvv4JEvsWYcIn5cKwB20bwrIXjKSCMOG-1WxqCVb5KJBDR2t6RcPD3BVnhSIDKlg_YBejp6iuD9MWQIEF0FCiuqIM_wSlkpofCZFOHvNmJAbUYpkXGJC06OXO2ghz4VDafqPhKqWjKNKmvyIjE3vCcfICtCrmnuU.OTnBx-b2WdBvK7vsN7yr9vYyfVmrsFy2lKxZKQ7vLEc&amp;dib_tag=se&amp;keywords=Dog%2BFood&amp;qid=1775708473&amp;rdc=1&amp;s=pet-supplies&amp;sr=1-8&amp;ts_id=2975359011&amp;th=1&amp;linkCode=ll2&amp;tag=babymydog03-20&amp;linkId=2e537102d4892b90a6e13b0930b23012&amp;language=en_US&amp;ref_=as_li_ss_tl</w:t>
+            </w:r>
+          </w:p>
+        </w:tc>
+        <w:tc>
+          <w:tcPr>
+            <w:tcW w:w="4945" w:type="dxa"/>
+          </w:tcPr>
+          <w:p>
+            <w:pPr>
+              <w:rPr>
+                <w:rFonts w:ascii="Arial Narrow" w:hAnsi="Arial Narrow"/>
+                <w:sz w:val="16"/>
+                <w:szCs w:val="16"/>
+              </w:rPr>
+            </w:pPr>
+            <w:r>
+              <w:rPr>
+                <w:rFonts w:ascii="Arial Narrow" w:hAnsi="Arial Narrow"/>
+                <w:sz w:val="16"/>
+                <w:szCs w:val="16"/>
+              </w:rPr>
+              <w:t>Purina Pro Plan Complete Essentials Shredded Blend Chicken and Rice Dog Food Dry Formula with Probiotics for Dogs - 35 lb. Bag</w:t>
+            </w:r>
+          </w:p>
+        </w:tc>
+      </w:tr>
+      <w:tr>
+        <w:tc>
+          <w:tcPr>
+            <w:tcW w:w="4405" w:type="dxa"/>
+          </w:tcPr>
+          <w:p>
+            <w:pPr>
+              <w:rPr>
+                <w:rFonts w:ascii="Arial Narrow" w:hAnsi="Arial Narrow"/>
+                <w:sz w:val="16"/>
+                <w:szCs w:val="16"/>
+              </w:rPr>
+            </w:pPr>
+            <w:r>
+              <w:rPr>
+                <w:rFonts w:ascii="Arial Narrow" w:hAnsi="Arial Narrow"/>
+                <w:sz w:val="16"/>
+                <w:szCs w:val="16"/>
+              </w:rPr>
+              <w:t>https://www.amazon.com/Blue-Buffalo-Protection-Formula-Adult/dp/B0009YWKUA?c=ts&amp;dib=eyJ2IjoiMSJ9.igPWBRgnpOd0CIQ3UJvpcZAMpRwB_iKwYtQyqn8VAYphzRL3wEUaE7CmwMSNGIDEQTliamkJcUNha3GyuzZV1eP0Bg4N3XuUUGTJzTXQk1VJPQHPWhT-zDXIzrgNi_b6kzSJM0D6KkCEvv4JEvsWYcIn5cKwB20bwrIXjKSCMOG-1WxqCVb5KJBDR2t6RcPD3BVnhSIDKlg_YBejp6iuD9MWQIEF0FCiuqIM_wSlkpofCZFOHvNmJAbUYpkXGJC06OXO2ghz4VDafqPhKqWjKNKmvyIjE3vCcfICtCrmnuU.OTnBx-b2WdBvK7vsN7yr9vYyfVmrsFy2lKxZKQ7vLEc&amp;dib_tag=se&amp;keywords=Dog%2BFood&amp;qid=1775708473&amp;rdc=1&amp;s=pet-supplies&amp;sr=1-9&amp;ts_id=2975359011&amp;th=1&amp;linkCode=ll2&amp;tag=babymydog03-20&amp;linkId=2aec24aca878542c90397a310b8625e6&amp;language=en_US&amp;ref_=as_li_ss_tl</w:t>
+            </w:r>
+          </w:p>
+        </w:tc>
+        <w:tc>
+          <w:tcPr>
+            <w:tcW w:w="4945" w:type="dxa"/>
+          </w:tcPr>
+          <w:p>
+            <w:pPr>
+              <w:rPr>
+                <w:rFonts w:ascii="Arial Narrow" w:hAnsi="Arial Narrow"/>
+                <w:sz w:val="16"/>
+                <w:szCs w:val="16"/>
+              </w:rPr>
+            </w:pPr>
+            <w:r>
+              <w:rPr>
+                <w:rFonts w:ascii="Arial Narrow" w:hAnsi="Arial Narrow"/>
+                <w:sz w:val="16"/>
+                <w:szCs w:val="16"/>
+              </w:rPr>
+              <w:t>Blue Buffalo Life Protection Formula Adult Dry Dog Food, Helps Build and Maintain Strong Muscles, Made with Natural Ingredients, Chicken &amp; Brown Rice Recipe, 30-lb. Bag</w:t>
+            </w:r>
+          </w:p>
+        </w:tc>
+      </w:tr>
+      <w:tr>
+        <w:tc>
+          <w:tcPr>
+            <w:tcW w:w="4405" w:type="dxa"/>
+          </w:tcPr>
+          <w:p>
+            <w:pPr>
+              <w:rPr>
+                <w:rFonts w:ascii="Arial Narrow" w:hAnsi="Arial Narrow"/>
+                <w:sz w:val="16"/>
+                <w:szCs w:val="16"/>
+              </w:rPr>
+            </w:pPr>
+            <w:r>
+              <w:rPr>
+                <w:rFonts w:ascii="Arial Narrow" w:hAnsi="Arial Narrow"/>
+                <w:sz w:val="16"/>
+                <w:szCs w:val="16"/>
+              </w:rPr>
+              <w:t>https://www.amazon.com/IAMS-Proactive-Health-Minichunks-Chicken/dp/B00BD741WM?c=ts&amp;dib=eyJ2IjoiMSJ9.igPWBRgnpOd0CIQ3UJvpcZAMpRwB_iKwYtQyqn8VAYphzRL3wEUaE7CmwMSNGIDEQTliamkJcUNha3GyuzZV1eP0Bg4N3XuUUGTJzTXQk1VJPQHPWhT-zDXIzrgNi_b6kzSJM0D6KkCEvv4JEvsWYcIn5cKwB20bwrIXjKSCMOG-1WxqCVb5KJBDR2t6RcPD3BVnhSIDKlg_YBejp6iuD9MWQIEF0FCiuqIM_wSlkpofCZFOHvNmJAbUYpkXGJC06OXO2ghz4VDafqPhKqWjKNKmvyIjE3vCcfICtCrmnuU.OTnBx-b2WdBvK7vsN7yr9vYyfVmrsFy2lKxZKQ7vLEc&amp;dib_tag=se&amp;keywords=Dog%2BFood&amp;qid=1775708473&amp;rdc=1&amp;s=pet-supplies&amp;sr=1-10&amp;ts_id=2975359011&amp;th=1&amp;linkCode=ll2&amp;tag=babymydog03-20&amp;linkId=407a1a9d1070133e9cb42724bd606321&amp;language=en_US&amp;ref_=as_li_ss_tl</w:t>
+            </w:r>
+          </w:p>
+        </w:tc>
+        <w:tc>
+          <w:tcPr>
+            <w:tcW w:w="4945" w:type="dxa"/>
+          </w:tcPr>
+          <w:p>
+            <w:pPr>
+              <w:rPr>
+                <w:rFonts w:ascii="Arial Narrow" w:hAnsi="Arial Narrow"/>
+                <w:sz w:val="16"/>
+                <w:szCs w:val="16"/>
+              </w:rPr>
+            </w:pPr>
+            <w:r>
+              <w:rPr>
+                <w:rFonts w:ascii="Arial Narrow" w:hAnsi="Arial Narrow"/>
+                <w:sz w:val="16"/>
+                <w:szCs w:val="16"/>
+              </w:rPr>
+              <w:t xml:space="preserve">IAMS Proactive Health Adult </w:t>
+            </w:r>
+            <w:proofErr w:type="spellStart"/>
+            <w:r>
+              <w:rPr>
+                <w:rFonts w:ascii="Arial Narrow" w:hAnsi="Arial Narrow"/>
+                <w:sz w:val="16"/>
+                <w:szCs w:val="16"/>
+              </w:rPr>
+              <w:t>Minichunks</w:t>
+            </w:r>
+            <w:proofErr w:type="spellEnd"/>
+            <w:r>
+              <w:rPr>
+                <w:rFonts w:ascii="Arial Narrow" w:hAnsi="Arial Narrow"/>
+                <w:sz w:val="16"/>
+                <w:szCs w:val="16"/>
+              </w:rPr>
+              <w:t xml:space="preserve"> Premium Dry Dog Food, Adult Dog Food Dry Recipe, 30 lb. Bag</w:t>
+            </w:r>
+          </w:p>
+        </w:tc>
+      </w:tr>
+      <w:tr>
+        <w:tc>
+          <w:tcPr>
+            <w:tcW w:w="4405" w:type="dxa"/>
+          </w:tcPr>
+          <w:p>
+            <w:pPr>
+              <w:rPr>
+                <w:rFonts w:ascii="Arial Narrow" w:hAnsi="Arial Narrow"/>
+                <w:sz w:val="16"/>
+                <w:szCs w:val="16"/>
+              </w:rPr>
+            </w:pPr>
+            <w:r>
+              <w:rPr>
+                <w:rFonts w:ascii="Arial Narrow" w:hAnsi="Arial Narrow"/>
+                <w:sz w:val="16"/>
+                <w:szCs w:val="16"/>
+              </w:rPr>
+              <w:t>https://www.amazon.com/Pedigree-Choice-30-Count-Variety-Pouches/dp/B08294GHXY?c=ts&amp;dib=eyJ2IjoiMSJ9.igPWBRgnpOd0CIQ3UJvpcZAMpRwB_iKwYtQyqn8VAYphzRL3wEUaE7CmwMSNGIDEQTliamkJcUNha3GyuzZV1eP0Bg4N3XuUUGTJzTXQk1VJPQHPWhT-zDXIzrgNi_b6kzSJM0D6KkCEvv4JEvsWYcIn5cKwB20bwrIXjKSCMOG-1WxqCVb5KJBDR2t6RcPD3BVnhSIDKlg_YBejp6iuD9MWQIEF0FCiuqIM_wSlkpofCZFOHvNmJAbUYpkXGJC06OXO2ghz4VDafqPhKqWjKNKmvyIjE3vCcfICtCrmnuU.OTnBx-b2WdBvK7vsN7yr9vYyfVmrsFy2lKxZKQ7vLEc&amp;dib_tag=se&amp;keywords=Dog%2BFood&amp;qid=1775708473&amp;rdc=1&amp;s=pet-supplies&amp;sr=1-11&amp;ts_id=2975359011&amp;th=1&amp;linkCode=ll2&amp;tag=babymydog03-20&amp;linkId=9a441d7c1a161f334143eb1625ee11de&amp;language=en_US&amp;ref_=as_li_ss_tl</w:t>
+            </w:r>
+          </w:p>
+        </w:tc>
+        <w:tc>
+          <w:tcPr>
+            <w:tcW w:w="4945" w:type="dxa"/>
+          </w:tcPr>
+          <w:p>
+            <w:pPr>
+              <w:rPr>
+                <w:rFonts w:ascii="Arial Narrow" w:hAnsi="Arial Narrow"/>
+                <w:sz w:val="16"/>
+                <w:szCs w:val="16"/>
+              </w:rPr>
+            </w:pPr>
+            <w:r>
+              <w:rPr>
+                <w:rFonts w:ascii="Arial Narrow" w:hAnsi="Arial Narrow"/>
+                <w:sz w:val="16"/>
+                <w:szCs w:val="16"/>
+              </w:rPr>
+              <w:t>Pedigree Choice Cuts in Gravy Wet Dog Food, Adult Soft Wet Dog Food, Variety Pack, 3.5 oz. Pouches, 30 Count</w:t>
+            </w:r>
+          </w:p>
+        </w:tc>
+      </w:tr>
+      <w:tr>
+        <w:tc>
+          <w:tcPr>
+            <w:tcW w:w="4405" w:type="dxa"/>
+          </w:tcPr>
+          <w:p>
+            <w:pPr>
+              <w:rPr>
+                <w:rFonts w:ascii="Arial Narrow" w:hAnsi="Arial Narrow"/>
+                <w:sz w:val="16"/>
+                <w:szCs w:val="16"/>
+              </w:rPr>
+            </w:pPr>
+            <w:r>
+              <w:rPr>
+                <w:rFonts w:ascii="Arial Narrow" w:hAnsi="Arial Narrow"/>
+                <w:sz w:val="16"/>
+                <w:szCs w:val="16"/>
+              </w:rPr>
+              <w:t>https://www.amazon.com/Purina-Pro-Plan-Shredded-Formula/dp/B00HHN04KE?c=ts&amp;dib=eyJ2IjoiMSJ9.igPWBRgnpOd0CIQ3UJvpcZAMpRwB_iKwYtQyqn8VAYphzRL3wEUaE7CmwMSNGIDEQTliamkJcUNha3GyuzZV1eP0Bg4N3XuUUGTJzTXQk1VJPQHPWhT-zDXIzrgNi_b6kzSJM0D6KkCEvv4JEvsWYcIn5cKwB20bwrIXjKSCMOG-1WxqCVb5KJBDR2t6RcPD3BVnhSIDKlg_YBejp6iuD9MWQIEF0FCiuqIM_wSlkpofCZFOHvNmJAbUYpkXGJC06OXO2ghz4VDafqPhKqWjKNKmvyIjE3vCcfICtCrmnuU.OTnBx-b2WdBvK7vsN7yr9vYyfVmrsFy2lKxZKQ7vLEc&amp;dib_tag=se&amp;keywords=Dog+Food&amp;qid=1775708473&amp;rdc=1&amp;s=pet-supplies&amp;sr=1-12&amp;ts_id=2975359011&amp;linkCode=ll2&amp;tag=babymydog03-20&amp;linkId=59359a0c999c8b30058c92ae7c8959c8&amp;language=en_US&amp;ref_=as_li_ss_tl</w:t>
+            </w:r>
+          </w:p>
+        </w:tc>
+        <w:tc>
+          <w:tcPr>
+            <w:tcW w:w="4945" w:type="dxa"/>
+          </w:tcPr>
+          <w:p>
+            <w:pPr>
+              <w:rPr>
+                <w:rFonts w:ascii="Arial Narrow" w:hAnsi="Arial Narrow"/>
+                <w:sz w:val="16"/>
+                <w:szCs w:val="16"/>
+              </w:rPr>
+            </w:pPr>
+            <w:r>
+              <w:rPr>
+                <w:rFonts w:ascii="Arial Narrow" w:hAnsi="Arial Narrow"/>
+                <w:sz w:val="16"/>
+                <w:szCs w:val="16"/>
+              </w:rPr>
+              <w:t xml:space="preserve">Purina Pro Plan Small Breed Dog Food </w:t>
+            </w:r>
+            <w:proofErr w:type="gramStart"/>
+            <w:r>
+              <w:rPr>
+                <w:rFonts w:ascii="Arial Narrow" w:hAnsi="Arial Narrow"/>
+                <w:sz w:val="16"/>
+                <w:szCs w:val="16"/>
+              </w:rPr>
+              <w:t>With</w:t>
+            </w:r>
+            <w:proofErr w:type="gramEnd"/>
+            <w:r>
+              <w:rPr>
+                <w:rFonts w:ascii="Arial Narrow" w:hAnsi="Arial Narrow"/>
+                <w:sz w:val="16"/>
+                <w:szCs w:val="16"/>
+              </w:rPr>
+              <w:t xml:space="preserve"> Probiotics for Dogs, Shredded Blend Chicken &amp; Rice Formula - 6 lb. Bag</w:t>
+            </w:r>
+          </w:p>
+        </w:tc>
+      </w:tr>
+      <w:tr>
+        <w:tc>
+          <w:tcPr>
+            <w:tcW w:w="4405" w:type="dxa"/>
+          </w:tcPr>
+          <w:p>
+            <w:pPr>
+              <w:rPr>
+                <w:rFonts w:ascii="Arial Narrow" w:hAnsi="Arial Narrow"/>
+                <w:sz w:val="16"/>
+                <w:szCs w:val="16"/>
+              </w:rPr>
+            </w:pPr>
+            <w:r>
+              <w:rPr>
+                <w:rFonts w:ascii="Arial Narrow" w:hAnsi="Arial Narrow"/>
+                <w:sz w:val="16"/>
+                <w:szCs w:val="16"/>
+              </w:rPr>
+              <w:t>https://www.amazon.com/Purina-Smartblend-Natural-Chicken-Formula/dp/B006JCUGVQ?c=ts&amp;dib=eyJ2IjoiMSJ9.igPWBRgnpOd0CIQ3UJvpcZAMpRwB_iKwYtQyqn8VAYphzRL3wEUaE7CmwMSNGIDEQTliamkJcUNha3GyuzZV1eP0Bg4N3XuUUGTJzTXQk1VJPQHPWhT-zDXIzrgNi_b6kzSJM0D6KkCEvv4JEvsWYcIn5cKwB20bwrIXjKSCMOG-1WxqCVb5KJBDR2t6RcPD3BVnhSIDKlg_YBejp6iuD9MWQIEF0FCiuqIM_wSlkpofCZFOHvNmJAbUYpkXGJC06OXO2ghz4VDafqPhKqWjKNKmvyIjE3vCcfICtCrmnuU.OTnBx-b2WdBvK7vsN7yr9vYyfVmrsFy2lKxZKQ7vLEc&amp;dib_tag=se&amp;keywords=Dog%2BFood&amp;qid=1775708473&amp;rdc=1&amp;s=pet-supplies&amp;sr=1-13&amp;ts_id=2975359011&amp;th=1&amp;linkCode=ll2&amp;tag=babymydog03-20&amp;linkId=aab7c5ab74f14cc2b5d7a77928e83ce1&amp;language=en_US&amp;ref_=as_li_ss_tl</w:t>
+            </w:r>
+          </w:p>
+        </w:tc>
+        <w:tc>
+          <w:tcPr>
+            <w:tcW w:w="4945" w:type="dxa"/>
+          </w:tcPr>
+          <w:p>
+            <w:pPr>
+              <w:rPr>
+                <w:rFonts w:ascii="Arial Narrow" w:hAnsi="Arial Narrow"/>
+                <w:sz w:val="16"/>
+                <w:szCs w:val="16"/>
+              </w:rPr>
+            </w:pPr>
+            <w:r>
+              <w:rPr>
+                <w:rFonts w:ascii="Arial Narrow" w:hAnsi="Arial Narrow"/>
+                <w:sz w:val="16"/>
+                <w:szCs w:val="16"/>
+              </w:rPr>
+              <w:t>Purina ONE Chicken and Rice Formula Dry Dog Food - 16.5 lb. Bag</w:t>
+            </w:r>
+          </w:p>
+        </w:tc>
+      </w:tr>
+      <w:tr>
+        <w:tc>
+          <w:tcPr>
+            <w:tcW w:w="4405" w:type="dxa"/>
+          </w:tcPr>
+          <w:p>
+            <w:pPr>
+              <w:rPr>
+                <w:rFonts w:ascii="Arial Narrow" w:hAnsi="Arial Narrow"/>
+                <w:sz w:val="16"/>
+                <w:szCs w:val="16"/>
+              </w:rPr>
+            </w:pPr>
+            <w:r>
+              <w:rPr>
+                <w:rFonts w:ascii="Arial Narrow" w:hAnsi="Arial Narrow"/>
+                <w:sz w:val="16"/>
+                <w:szCs w:val="16"/>
+              </w:rPr>
+              <w:t>https://www.amazon.com/Purina-Pro-Plan-Sensitive-Stomach/dp/B01EY9KPZM?c=ts&amp;dib=eyJ2IjoiMSJ9.igPWBRgnpOd0CIQ3UJvpcZAMpRwB_iKwYtQyqn8VAYphzRL3wEUaE7CmwMSNGIDEQTliamkJcUNha3GyuzZV1eP0Bg4N3XuUUGTJzTXQk1VJPQHPWhT-zDXIzrgNi_b6kzSJM0D6KkCEvv4JEvsWYcIn5cKwB20bwrIXjKSCMOG-1WxqCVb5KJBDR2t6RcPD3BVnhSIDKlg_YBejp6iuD9MWQIEF0FCiuqIM_wSlkpofCZFOHvNmJAbUYpkXGJC06OXO2ghz4VDafqPhKqWjKNKmvyIjE3vCcfICtCrmnuU.OTnBx-b2WdBvK7vsN7yr9vYyfVmrsFy2lKxZKQ7vLEc&amp;dib_tag=se&amp;keywords=Dog+Food&amp;qid=1775708473&amp;rdc=1&amp;s=pet-supplies&amp;sr=1-14&amp;ts_id=2975359011&amp;linkCode=ll2&amp;tag=babymydog03-20&amp;linkId=36ad55678909ed4b2956250beec80f8e&amp;language=en_US&amp;ref_=as_li_ss_tl</w:t>
+            </w:r>
+          </w:p>
+        </w:tc>
+        <w:tc>
+          <w:tcPr>
+            <w:tcW w:w="4945" w:type="dxa"/>
+          </w:tcPr>
+          <w:p>
+            <w:pPr>
+              <w:rPr>
+                <w:rFonts w:ascii="Arial Narrow" w:hAnsi="Arial Narrow"/>
+                <w:sz w:val="16"/>
+                <w:szCs w:val="16"/>
+              </w:rPr>
+            </w:pPr>
+            <w:r>
+              <w:rPr>
+                <w:rFonts w:ascii="Arial Narrow" w:hAnsi="Arial Narrow"/>
+                <w:sz w:val="16"/>
+                <w:szCs w:val="16"/>
+              </w:rPr>
+              <w:t>Purina Pro Plan Sensitive Skin and Stomach Dog Food Dry, Adult Salmon &amp; Rice Formula, Digestive Health - 16 lb. Bag</w:t>
+            </w:r>
+          </w:p>
+        </w:tc>
+      </w:tr>
+      <w:tr>
+        <w:tc>
+          <w:tcPr>
+            <w:tcW w:w="4405" w:type="dxa"/>
+          </w:tcPr>
+          <w:p>
+            <w:pPr>
+              <w:rPr>
+                <w:rFonts w:ascii="Arial Narrow" w:hAnsi="Arial Narrow"/>
+                <w:sz w:val="16"/>
+                <w:szCs w:val="16"/>
+              </w:rPr>
+            </w:pPr>
+            <w:r>
+              <w:rPr>
+                <w:rFonts w:ascii="Arial Narrow" w:hAnsi="Arial Narrow"/>
+                <w:sz w:val="16"/>
+                <w:szCs w:val="16"/>
+              </w:rPr>
+              <w:t>https://www.amazon.com/Science-Diet-Sensitive-Stomach-Chicken/dp/B003MGAIDI?c=ts&amp;dib=eyJ2IjoiMSJ9.igPWBRgnpOd0CIQ3UJvpcZAMpRwB_iKwYtQyqn8VAYphzRL3wEUaE7CmwMSNGIDEQTliamkJcUNha3GyuzZV1eP0Bg4N3XuUUGTJzTXQk1VJPQHPWhT-zDXIzrgNi_b6kzSJM0D6KkCEvv4JEvsWYcIn5cKwB20bwrIXjKSCMOG-1WxqCVb5KJBDR2t6RcPD3BVnhSIDKlg_YBejp6iuD9MWQIEF0FCiuqIM_wSlkpofCZFOHvNmJAbUYpkXGJC06OXO2ghz4VDafqPhKqWjKNKmvyIjE3vCcfICtCrmnuU.OTnBx-b2WdBvK7vsN7yr9vYyfVmrsFy2lKxZKQ7vLEc&amp;dib_tag=se&amp;keywords=Dog%2BFood&amp;qid=1775708473&amp;rdc=1&amp;s=pet-supplies&amp;sr=1-15&amp;ts_id=2975359011&amp;th=1&amp;linkCode=ll2&amp;tag=babymydog03-20&amp;linkId=71a4f5128aff521f5b9f25aed851f7ac&amp;language=en_US&amp;ref_=as_li_ss_tl</w:t>
+            </w:r>
+          </w:p>
+        </w:tc>
+        <w:tc>
+          <w:tcPr>
+            <w:tcW w:w="4945" w:type="dxa"/>
+          </w:tcPr>
+          <w:p>
+            <w:pPr>
+              <w:rPr>
+                <w:rFonts w:ascii="Arial Narrow" w:hAnsi="Arial Narrow"/>
+                <w:sz w:val="16"/>
+                <w:szCs w:val="16"/>
+              </w:rPr>
+            </w:pPr>
+            <w:r>
+              <w:rPr>
+                <w:rFonts w:ascii="Arial Narrow" w:hAnsi="Arial Narrow"/>
+                <w:sz w:val="16"/>
+                <w:szCs w:val="16"/>
+              </w:rPr>
+              <w:t>Hill's Science Diet Adult Sensitive Stomach &amp; Skin Dry Dog Food, Chicken, 30 lb. Bag</w:t>
+            </w:r>
+          </w:p>
+        </w:tc>
+      </w:tr>
+      <w:tr>
+        <w:tc>
+          <w:tcPr>
+            <w:tcW w:w="4405" w:type="dxa"/>
+          </w:tcPr>
+          <w:p>
+            <w:pPr>
+              <w:rPr>
+                <w:rFonts w:ascii="Arial Narrow" w:hAnsi="Arial Narrow"/>
+                <w:sz w:val="16"/>
+                <w:szCs w:val="16"/>
+              </w:rPr>
+            </w:pPr>
+            <w:r>
+              <w:rPr>
+                <w:rFonts w:ascii="Arial Narrow" w:hAnsi="Arial Narrow"/>
+                <w:sz w:val="16"/>
+                <w:szCs w:val="16"/>
+              </w:rPr>
+              <w:t>https://www.amazon.com/Rachael-Ray-Nutrish-Variety-Ounce/dp/B0176Q0CQW?c=ts&amp;dib=eyJ2IjoiMSJ9.igPWBRgnpOd0CIQ3UJvpcZAMpRwB_iKwYtQyqn8VAYphzRL3wEUaE7CmwMSNGIDEQTliamkJcUNha3GyuzZV1eP0Bg4N3XuUUGTJzTXQk1VJPQHPWhT-zDXIzrgNi_b6kzSJM0D6KkCEvv4JEvsWYcIn5cKwB20bwrIXjKSCMOG-1WxqCVb5KJBDR2t6RcPD3BVnhSIDKlg_YBejp6iuD9MWQIEF0FCiuqIM_wSlkpofCZFOHvNmJAbUYpkXGJC06OXO2ghz4VDafqPhKqWjKNKmvyIjE3vCcfICtCrmnuU.OTnBx-b2WdBvK7vsN7yr9vYyfVmrsFy2lKxZKQ7vLEc&amp;dib_tag=se&amp;keywords=Dog%2BFood&amp;qid=1775708473&amp;rdc=1&amp;s=pet-supplies&amp;sr=1-16&amp;ts_id=2975359011&amp;th=1&amp;linkCode=ll2&amp;tag=babymydog03-20&amp;linkId=ccc2258d7e2651c08102b27650379228&amp;language=en_US&amp;ref_=as_li_ss_tl</w:t>
+            </w:r>
+          </w:p>
+        </w:tc>
+        <w:tc>
+          <w:tcPr>
+            <w:tcW w:w="4945" w:type="dxa"/>
+          </w:tcPr>
+          <w:p>
+            <w:pPr>
+              <w:rPr>
+                <w:rFonts w:ascii="Arial Narrow" w:hAnsi="Arial Narrow"/>
+                <w:sz w:val="16"/>
+                <w:szCs w:val="16"/>
+              </w:rPr>
+            </w:pPr>
+            <w:proofErr w:type="spellStart"/>
+            <w:r>
+              <w:rPr>
+                <w:rFonts w:ascii="Arial Narrow" w:hAnsi="Arial Narrow"/>
+                <w:sz w:val="16"/>
+                <w:szCs w:val="16"/>
+              </w:rPr>
+              <w:t>Nutrish</w:t>
+            </w:r>
+            <w:proofErr w:type="spellEnd"/>
+            <w:r>
+              <w:rPr>
+                <w:rFonts w:ascii="Arial Narrow" w:hAnsi="Arial Narrow"/>
+                <w:sz w:val="16"/>
+                <w:szCs w:val="16"/>
+              </w:rPr>
+              <w:t xml:space="preserve"> Rachael Ray Premium Natural Wet Dog Food, Savory Favorites Variety Pack, 8 Ounce Tub (Pack of 6)</w:t>
+            </w:r>
+          </w:p>
+        </w:tc>
+      </w:tr>
+      <w:tr>
+        <w:tc>
+          <w:tcPr>
+            <w:tcW w:w="4405" w:type="dxa"/>
+          </w:tcPr>
+          <w:p>
+            <w:pPr>
+              <w:rPr>
+                <w:rFonts w:ascii="Arial Narrow" w:hAnsi="Arial Narrow"/>
+                <w:sz w:val="16"/>
+                <w:szCs w:val="16"/>
+              </w:rPr>
+            </w:pPr>
+            <w:r>
+              <w:rPr>
+                <w:rFonts w:ascii="Arial Narrow" w:hAnsi="Arial Narrow"/>
+                <w:sz w:val="16"/>
+                <w:szCs w:val="16"/>
+              </w:rPr>
+              <w:t>https://www.amazon.com/Purina-Smartblend-Natural-Classic-Variety/dp/B073PC2VH8?c=ts&amp;dib=eyJ2IjoiMSJ9.igPWBRgnpOd0CIQ3UJvpcZAMpRwB_iKwYtQyqn8VAYphzRL3wEUaE7CmwMSNGIDEQTliamkJcUNha3GyuzZV1eP0Bg4N3XuUUGTJzTXQk1VJPQHPWhT-zDXIzrgNi_b6kzSJM0D6KkCEvv4JEvsWYcIn5cKwB20bwrIXjKSCMOG-1WxqCVb5KJBDR2t6RcPD3BVnhSIDKlg_YBejp6iuD9MWQIEF0FCiuqIM_wSlkpofCZFOHvNmJAbUYpkXGJC06OXO2ghz4VDafqPhKqWjKNKmvyIjE3vCcfICtCrmnuU.OTnBx-b2WdBvK7vsN7yr9vYyfVmrsFy2lKxZKQ7vLEc&amp;dib_tag=se&amp;keywords=Dog+Food&amp;qid=1775708473&amp;rdc=1&amp;s=pet-supplies&amp;sr=1-17&amp;ts_id=2975359011&amp;linkCode=ll2&amp;tag=babymydog03-20&amp;linkId=2f28f0c24992801f657f345af088b3f0&amp;language=en_US&amp;ref_=as_li_ss_tl</w:t>
+            </w:r>
+          </w:p>
+        </w:tc>
+        <w:tc>
+          <w:tcPr>
+            <w:tcW w:w="4945" w:type="dxa"/>
+          </w:tcPr>
+          <w:p>
+            <w:pPr>
+              <w:rPr>
+                <w:rFonts w:ascii="Arial Narrow" w:hAnsi="Arial Narrow"/>
+                <w:sz w:val="16"/>
+                <w:szCs w:val="16"/>
+              </w:rPr>
+            </w:pPr>
+            <w:r>
+              <w:rPr>
+                <w:rFonts w:ascii="Arial Narrow" w:hAnsi="Arial Narrow"/>
+                <w:sz w:val="16"/>
+                <w:szCs w:val="16"/>
+              </w:rPr>
+              <w:t>Purina ONE Classic Ground Chicken and Brown Rice, and Beef and Brown Rice Entrees Wet Dog Food Variety Pack - (Pack of 6) 13 oz. Cans</w:t>
+            </w:r>
+          </w:p>
+        </w:tc>
+      </w:tr>
+      <w:tr>
+        <w:tc>
+          <w:tcPr>
+            <w:tcW w:w="4405" w:type="dxa"/>
+          </w:tcPr>
+          <w:p>
+            <w:pPr>
+              <w:rPr>
+                <w:rFonts w:ascii="Arial Narrow" w:hAnsi="Arial Narrow"/>
+                <w:sz w:val="16"/>
+                <w:szCs w:val="16"/>
+              </w:rPr>
+            </w:pPr>
+            <w:r>
+              <w:rPr>
+                <w:rFonts w:ascii="Arial Narrow" w:hAnsi="Arial Narrow"/>
+                <w:sz w:val="16"/>
+                <w:szCs w:val="16"/>
+              </w:rPr>
+              <w:t>https://www.amazon.com/Purina-Beneful-Variety-Medleys-Mediterranean/dp/B08S8S9HGB?c=ts&amp;dib=eyJ2IjoiMSJ9.igPWBRgnpOd0CIQ3UJvpcZAMpRwB_iKwYtQyqn8VAYphzRL3wEUaE7CmwMSNGIDEQTliamkJcUNha3GyuzZV1eP0Bg4N3XuUUGTJzTXQk1VJPQHPWhT-zDXIzrgNi_b6kzSJM0D6KkCEvv4JEvsWYcIn5cKwB20bwrIXjKSCMOG-1WxqCVb5KJBDR2t6RcPD3BVnhSIDKlg_YBejp6iuD9MWQIEF0FCiuqIM_wSlkpofCZFOHvNmJAbUYpkXGJC06OXO2ghz4VDafqPhKqWjKNKmvyIjE3vCcfICtCrmnuU.OTnBx-b2WdBvK7vsN7yr9vYyfVmrsFy2lKxZKQ7vLEc&amp;dib_tag=se&amp;keywords=Dog+Food&amp;qid=1775708473&amp;rdc=1&amp;s=pet-supplies&amp;sr=1-18&amp;ts_id=2975359011&amp;linkCode=ll2&amp;tag=babymydog03-20&amp;linkId=bac39417f1b52856c22548c860ed67be&amp;language=en_US&amp;ref_=as_li_ss_tl</w:t>
+            </w:r>
+          </w:p>
+        </w:tc>
+        <w:tc>
+          <w:tcPr>
+            <w:tcW w:w="4945" w:type="dxa"/>
+          </w:tcPr>
+          <w:p>
+            <w:pPr>
+              <w:rPr>
+                <w:rFonts w:ascii="Arial Narrow" w:hAnsi="Arial Narrow"/>
+                <w:sz w:val="16"/>
+                <w:szCs w:val="16"/>
+              </w:rPr>
+            </w:pPr>
+            <w:r>
+              <w:rPr>
+                <w:rFonts w:ascii="Arial Narrow" w:hAnsi="Arial Narrow"/>
+                <w:sz w:val="16"/>
+                <w:szCs w:val="16"/>
+              </w:rPr>
+              <w:t xml:space="preserve">Purina </w:t>
+            </w:r>
+            <w:proofErr w:type="spellStart"/>
+            <w:r>
+              <w:rPr>
+                <w:rFonts w:ascii="Arial Narrow" w:hAnsi="Arial Narrow"/>
+                <w:sz w:val="16"/>
+                <w:szCs w:val="16"/>
+              </w:rPr>
+              <w:t>Beneful</w:t>
+            </w:r>
+            <w:proofErr w:type="spellEnd"/>
+            <w:r>
+              <w:rPr>
+                <w:rFonts w:ascii="Arial Narrow" w:hAnsi="Arial Narrow"/>
+                <w:sz w:val="16"/>
+                <w:szCs w:val="16"/>
+              </w:rPr>
+              <w:t xml:space="preserve"> Kitchen Creations </w:t>
+            </w:r>
+            <w:proofErr w:type="gramStart"/>
+            <w:r>
+              <w:rPr>
+                <w:rFonts w:ascii="Arial Narrow" w:hAnsi="Arial Narrow"/>
+                <w:sz w:val="16"/>
+                <w:szCs w:val="16"/>
+              </w:rPr>
+              <w:t>With</w:t>
+            </w:r>
+            <w:proofErr w:type="gramEnd"/>
+            <w:r>
+              <w:rPr>
+                <w:rFonts w:ascii="Arial Narrow" w:hAnsi="Arial Narrow"/>
+                <w:sz w:val="16"/>
+                <w:szCs w:val="16"/>
+              </w:rPr>
+              <w:t xml:space="preserve"> Beef, Chicken, or Lamb Wet Dog Food Variety Pack - (Pack of 30) 3 oz. Cans</w:t>
+            </w:r>
+          </w:p>
+        </w:tc>
+      </w:tr>
+      <w:tr>
+        <w:tc>
+          <w:tcPr>
+            <w:tcW w:w="4405" w:type="dxa"/>
+          </w:tcPr>
+          <w:p>
+            <w:pPr>
+              <w:rPr>
+                <w:rFonts w:ascii="Arial Narrow" w:hAnsi="Arial Narrow"/>
+                <w:sz w:val="16"/>
+                <w:szCs w:val="16"/>
+              </w:rPr>
+            </w:pPr>
+            <w:r>
+              <w:rPr>
+                <w:rFonts w:ascii="Arial Narrow" w:hAnsi="Arial Narrow"/>
+                <w:sz w:val="16"/>
+                <w:szCs w:val="16"/>
+              </w:rPr>
+              <w:t>https://www.amazon.com/Blue-Buffalo-Homestyle-Chicken-Variety/dp/B0BMDXQ4FF?c=ts&amp;dib=eyJ2IjoiMSJ9.igPWBRgnpOd0CIQ3UJvpcZAMpRwB_iKwYtQyqn8VAYphzRL3wEUaE7CmwMSNGIDEQTliamkJcUNha3GyuzZV1eP0Bg4N3XuUUGTJzTXQk1VJPQHPWhT-zDXIzrgNi_b6kzSJM0D6KkCEvv4JEvsWYcIn5cKwB20bwrIXjKSCMOG-1WxqCVb5KJBDR2t6RcPD3BVnhSIDKlg_YBejp6iuD9MWQIEF0FCiuqIM_wSlkpofCZFOHvNmJAbUYpkXGJC06OXO2ghz4VDafqPhKqWjKNKmvyIjE3vCcfICtCrmnuU.OTnBx-b2WdBvK7vsN7yr9vYyfVmrsFy2lKxZKQ7vLEc&amp;dib_tag=se&amp;keywords=Dog%2BFood&amp;qid=1775708473&amp;rdc=1&amp;s=pet-supplies&amp;sr=1-19&amp;ts_id=2975359011&amp;th=1&amp;linkCode=ll2&amp;tag=babymydog03-20&amp;linkId=1447ab3a1659eba42856168b0d15d581&amp;language=en_US&amp;ref_=as_li_ss_tl</w:t>
+            </w:r>
+          </w:p>
+        </w:tc>
+        <w:tc>
+          <w:tcPr>
+            <w:tcW w:w="4945" w:type="dxa"/>
+          </w:tcPr>
+          <w:p>
+            <w:pPr>
+              <w:rPr>
+                <w:rFonts w:ascii="Arial Narrow" w:hAnsi="Arial Narrow"/>
+                <w:sz w:val="16"/>
+                <w:szCs w:val="16"/>
+              </w:rPr>
+            </w:pPr>
+            <w:r>
+              <w:rPr>
+                <w:rFonts w:ascii="Arial Narrow" w:hAnsi="Arial Narrow"/>
+                <w:sz w:val="16"/>
+                <w:szCs w:val="16"/>
+              </w:rPr>
+              <w:t>Blue Buffalo Homestyle Recipe Adult Wet Dog Food, Made with Natural Ingredients, Chicken and Beef Dinner Variety Pack, 12.5-</w:t>
+            </w:r>
+            <w:proofErr w:type="gramStart"/>
+            <w:r>
+              <w:rPr>
+                <w:rFonts w:ascii="Arial Narrow" w:hAnsi="Arial Narrow"/>
+                <w:sz w:val="16"/>
+                <w:szCs w:val="16"/>
+              </w:rPr>
+              <w:t>oz Cans</w:t>
+            </w:r>
+            <w:proofErr w:type="gramEnd"/>
+            <w:r>
+              <w:rPr>
+                <w:rFonts w:ascii="Arial Narrow" w:hAnsi="Arial Narrow"/>
+                <w:sz w:val="16"/>
+                <w:szCs w:val="16"/>
+              </w:rPr>
+              <w:t xml:space="preserve"> (6 Count, 3 of Each)</w:t>
+            </w:r>
+          </w:p>
+        </w:tc>
+      </w:tr>
+      <w:tr>
+        <w:tc>
+          <w:tcPr>
+            <w:tcW w:w="4405" w:type="dxa"/>
+          </w:tcPr>
+          <w:p>
+            <w:pPr>
+              <w:rPr>
+                <w:rFonts w:ascii="Arial Narrow" w:hAnsi="Arial Narrow"/>
+                <w:sz w:val="16"/>
+                <w:szCs w:val="16"/>
+              </w:rPr>
+            </w:pPr>
+            <w:r>
+              <w:rPr>
+                <w:rFonts w:ascii="Arial Narrow" w:hAnsi="Arial Narrow"/>
+                <w:sz w:val="16"/>
+                <w:szCs w:val="16"/>
+              </w:rPr>
+              <w:t>https://www.amazon.com/Pedigree-Choice-Country-Canned-Variety/dp/B000SSXDBM?c=ts&amp;dib=eyJ2IjoiMSJ9.igPWBRgnpOd0CIQ3UJvpcZAMpRwB_iKwYtQyqn8VAYphzRL3wEUaE7CmwMSNGIDEQTliamkJcUNha3GyuzZV1eP0Bg4N3XuUUGTJzTXQk1VJPQHPWhT-zDXIzrgNi_b6kzSJM0D6KkCEvv4JEvsWYcIn5cKwB20bwrIXjKSCMOG-1WxqCVb5KJBDR2t6RcPD3BVnhSIDKlg_YBejp6iuD9MWQIEF0FCiuqIM_wSlkpofCZFOHvNmJAbUYpkXGJC06OXO2ghz4VDafqPhKqWjKNKmvyIjE3vCcfICtCrmnuU.OTnBx-b2WdBvK7vsN7yr9vYyfVmrsFy2lKxZKQ7vLEc&amp;dib_tag=se&amp;keywords=Dog%2BFood&amp;qid=1775708473&amp;rdc=1&amp;s=pet-supplies&amp;sr=1-20&amp;ts_id=2975359011&amp;th=1&amp;linkCode=ll2&amp;tag=babymydog03-20&amp;linkId=664a1f05dc7da3a26ab86afa40231368&amp;language=en_US&amp;ref_=as_li_ss_tl</w:t>
+            </w:r>
+          </w:p>
+        </w:tc>
+        <w:tc>
+          <w:tcPr>
+            <w:tcW w:w="4945" w:type="dxa"/>
+          </w:tcPr>
+          <w:p>
+            <w:pPr>
+              <w:rPr>
+                <w:rFonts w:ascii="Arial Narrow" w:hAnsi="Arial Narrow"/>
+                <w:sz w:val="16"/>
+                <w:szCs w:val="16"/>
+              </w:rPr>
+            </w:pPr>
+            <w:r>
+              <w:rPr>
+                <w:rFonts w:ascii="Arial Narrow" w:hAnsi="Arial Narrow"/>
+                <w:sz w:val="16"/>
+                <w:szCs w:val="16"/>
+              </w:rPr>
+              <w:t>Pedigree Wet Dog Food, Choice Cuts Adult Canned Dog Food, Beef &amp; Country Stew Multipack, 13.2 oz. Cans (12 Count, Pack of 1)</w:t>
+            </w:r>
+          </w:p>
+        </w:tc>
+      </w:tr>
+      <w:tr>
+        <w:tc>
+          <w:tcPr>
+            <w:tcW w:w="4405" w:type="dxa"/>
+          </w:tcPr>
+          <w:p>
+            <w:pPr>
+              <w:rPr>
+                <w:rFonts w:ascii="Arial Narrow" w:hAnsi="Arial Narrow"/>
+                <w:sz w:val="16"/>
+                <w:szCs w:val="16"/>
+              </w:rPr>
+            </w:pPr>
+            <w:r>
+              <w:rPr>
+                <w:rFonts w:ascii="Arial Narrow" w:hAnsi="Arial Narrow"/>
+                <w:sz w:val="16"/>
+                <w:szCs w:val="16"/>
+              </w:rPr>
+              <w:t>https://www.amazon.com/Stella-Chewys-Bountiful-Grass-Fed-Resealable/dp/B0BJHDP1LP?c=ts&amp;dib=eyJ2IjoiMSJ9.igPWBRgnpOd0CIQ3UJvpcZAMpRwB_iKwYtQyqn8VAYphzRL3wEUaE7CmwMSNGIDEQTliamkJcUNha3GyuzZV1eP0Bg4N3XuUUGTJzTXQk1VJPQHPWhT-zDXIzrgNi_b6kzSJM0D6KkCEvv4JEvsWYcIn5cKwB20bwrIXjKSCMOG-1WxqCVb5KJBDR2t6RcPD3BVnhSIDKlg_YBejp6iuD9MWQIEF0FCiuqIM_wSlkpofCZFOHvNmJAbUYpkXGJC06OXO2ghz4VDafqPhKqWjKNKmvyIjE3vCcfICtCrmnuU.OTnBx-b2WdBvK7vsN7yr9vYyfVmrsFy2lKxZKQ7vLEc&amp;dib_tag=se&amp;keywords=Dog%2BFood&amp;qid=1775708473&amp;rdc=1&amp;s=pet-supplies&amp;sr=1-21&amp;ts_id=2975359011&amp;th=1&amp;linkCode=ll2&amp;tag=babymydog03-20&amp;linkId=1f40de44021290ad7fea11f0b6bd33b1&amp;language=en_US&amp;ref_=as_li_ss_tl</w:t>
+            </w:r>
+          </w:p>
+        </w:tc>
+        <w:tc>
+          <w:tcPr>
+            <w:tcW w:w="4945" w:type="dxa"/>
+          </w:tcPr>
+          <w:p>
+            <w:pPr>
+              <w:rPr>
+                <w:rFonts w:ascii="Arial Narrow" w:hAnsi="Arial Narrow"/>
+                <w:sz w:val="16"/>
+                <w:szCs w:val="16"/>
+              </w:rPr>
+            </w:pPr>
+            <w:r>
+              <w:rPr>
+                <w:rFonts w:ascii="Arial Narrow" w:hAnsi="Arial Narrow"/>
+                <w:sz w:val="16"/>
+                <w:szCs w:val="16"/>
+              </w:rPr>
+              <w:t xml:space="preserve">Stella &amp; </w:t>
+            </w:r>
+            <w:proofErr w:type="spellStart"/>
+            <w:r>
+              <w:rPr>
+                <w:rFonts w:ascii="Arial Narrow" w:hAnsi="Arial Narrow"/>
+                <w:sz w:val="16"/>
+                <w:szCs w:val="16"/>
+              </w:rPr>
+              <w:t>Chewy's</w:t>
+            </w:r>
+            <w:proofErr w:type="spellEnd"/>
+            <w:r>
+              <w:rPr>
+                <w:rFonts w:ascii="Arial Narrow" w:hAnsi="Arial Narrow"/>
+                <w:sz w:val="16"/>
+                <w:szCs w:val="16"/>
+              </w:rPr>
+              <w:t xml:space="preserve"> Human-Grade Grass-Fed Beef Bone Broth for Dogs - Joint &amp; Gut Health Liquid Food Topper with Collagen &amp; Turmeric, 16 Fl Oz Resealable Pouch</w:t>
+            </w:r>
+          </w:p>
+        </w:tc>
+      </w:tr>
+      <w:tr>
+        <w:tc>
+          <w:tcPr>
+            <w:tcW w:w="4405" w:type="dxa"/>
+          </w:tcPr>
+          <w:p>
+            <w:pPr>
+              <w:rPr>
+                <w:rFonts w:ascii="Arial Narrow" w:hAnsi="Arial Narrow"/>
+                <w:sz w:val="16"/>
+                <w:szCs w:val="16"/>
+              </w:rPr>
+            </w:pPr>
+            <w:r>
+              <w:rPr>
+                <w:rFonts w:ascii="Arial Narrow" w:hAnsi="Arial Narrow"/>
+                <w:sz w:val="16"/>
+                <w:szCs w:val="16"/>
+              </w:rPr>
+              <w:t>https://www.amazon.com/Cesar-Mignon-Flavor-Vegetables-Garnish/dp/B01MYW7B8N?c=ts&amp;dib=eyJ2IjoiMSJ9.igPWBRgnpOd0CIQ3UJvpcZAMpRwB_iKwYtQyqn8VAYphzRL3wEUaE7CmwMSNGIDEQTliamkJcUNha3GyuzZV1eP0Bg4N3XuUUGTJzTXQk1VJPQHPWhT-zDXIzrgNi_b6kzSJM0D6KkCEvv4JEvsWYcIn5cKwB20bwrIXjKSCMOG-1WxqCVb5KJBDR2t6RcPD3BVnhSIDKlg_YBejp6iuD9MWQIEF0FCiuqIM_wSlkpofCZFOHvNmJAbUYpkXGJC06OXO2ghz4VDafqPhKqWjKNKmvyIjE3vCcfICtCrmnuU.OTnBx-b2WdBvK7vsN7yr9vYyfVmrsFy2lKxZKQ7vLEc&amp;dib_tag=se&amp;keywords=Dog%2BFood&amp;qid=1775708473&amp;rdc=1&amp;s=pet-supplies&amp;sr=1-22&amp;ts_id=2975359011&amp;th=1&amp;linkCode=ll2&amp;tag=babymydog03-20&amp;linkId=b3f2f31f129244d77ba7f4b6d8d4e0c6&amp;language=en_US&amp;ref_=as_li_ss_tl</w:t>
+            </w:r>
+          </w:p>
+        </w:tc>
+        <w:tc>
+          <w:tcPr>
+            <w:tcW w:w="4945" w:type="dxa"/>
+          </w:tcPr>
+          <w:p>
+            <w:pPr>
+              <w:rPr>
+                <w:rFonts w:ascii="Arial Narrow" w:hAnsi="Arial Narrow"/>
+                <w:sz w:val="16"/>
+                <w:szCs w:val="16"/>
+              </w:rPr>
+            </w:pPr>
+            <w:r>
+              <w:rPr>
+                <w:rFonts w:ascii="Arial Narrow" w:hAnsi="Arial Narrow"/>
+                <w:sz w:val="16"/>
+                <w:szCs w:val="16"/>
+              </w:rPr>
+              <w:t xml:space="preserve">Cesar Small Breed Dry Dog Food for Small Dogs, Filet Mignon Flavor and Spring Vegetables Garnish, 12 </w:t>
+            </w:r>
+            <w:proofErr w:type="spellStart"/>
+            <w:r>
+              <w:rPr>
+                <w:rFonts w:ascii="Arial Narrow" w:hAnsi="Arial Narrow"/>
+                <w:sz w:val="16"/>
+                <w:szCs w:val="16"/>
+              </w:rPr>
+              <w:t>lb</w:t>
+            </w:r>
+            <w:proofErr w:type="spellEnd"/>
+            <w:r>
+              <w:rPr>
+                <w:rFonts w:ascii="Arial Narrow" w:hAnsi="Arial Narrow"/>
+                <w:sz w:val="16"/>
+                <w:szCs w:val="16"/>
+              </w:rPr>
+              <w:t xml:space="preserve"> Bag</w:t>
+            </w:r>
+          </w:p>
+        </w:tc>
+      </w:tr>
+      <w:tr>
+        <w:tc>
+          <w:tcPr>
+            <w:tcW w:w="4405" w:type="dxa"/>
+          </w:tcPr>
+          <w:p>
+            <w:pPr>
+              <w:rPr>
+                <w:rFonts w:ascii="Arial Narrow" w:hAnsi="Arial Narrow"/>
+                <w:sz w:val="16"/>
+                <w:szCs w:val="16"/>
+              </w:rPr>
+            </w:pPr>
+            <w:r>
+              <w:rPr>
+                <w:rFonts w:ascii="Arial Narrow" w:hAnsi="Arial Narrow"/>
+                <w:sz w:val="16"/>
+                <w:szCs w:val="16"/>
+              </w:rPr>
+              <w:t>https://www.amazon.com/Purina-Pro-Plan-Sensitive-Stomach/dp/B0CPRD2NTN?c=ts&amp;dib=eyJ2IjoiMSJ9.igPWBRgnpOd0CIQ3UJvpcZAMpRwB_iKwYtQyqn8VAYphzRL3wEUaE7CmwMSNGIDEQTliamkJcUNha3GyuzZV1eP0Bg4N3XuUUGTJzTXQk1VJPQHPWhT-zDXIzrgNi_b6kzSJM0D6KkCEvv4JEvsWYcIn5cKwB20bwrIXjKSCMOG-1WxqCVb5KJBDR2t6RcPD3BVnhSIDKlg_YBejp6iuD9MWQIEF0FCiuqIM_wSlkpofCZFOHvNmJAbUYpkXGJC06OXO2ghz4VDafqPhKqWjKNKmvyIjE3vCcfICtCrmnuU.OTnBx-b2WdBvK7vsN7yr9vYyfVmrsFy2lKxZKQ7vLEc&amp;dib_tag=se&amp;keywords=Dog%2BFood&amp;qid=1775708473&amp;rdc=1&amp;s=pet-supplies&amp;sr=1-23&amp;ts_id=2975359011&amp;th=1&amp;linkCode=ll2&amp;tag=babymydog03-20&amp;linkId=1ade13f81134236ba2277412757d1152&amp;language=en_US&amp;ref_=as_li_ss_tl</w:t>
+            </w:r>
+          </w:p>
+        </w:tc>
+        <w:tc>
+          <w:tcPr>
+            <w:tcW w:w="4945" w:type="dxa"/>
+          </w:tcPr>
+          <w:p>
+            <w:pPr>
+              <w:rPr>
+                <w:rFonts w:ascii="Arial Narrow" w:hAnsi="Arial Narrow"/>
+                <w:sz w:val="16"/>
+                <w:szCs w:val="16"/>
+              </w:rPr>
+            </w:pPr>
+            <w:r>
+              <w:rPr>
+                <w:rFonts w:ascii="Arial Narrow" w:hAnsi="Arial Narrow"/>
+                <w:sz w:val="16"/>
+                <w:szCs w:val="16"/>
+              </w:rPr>
+              <w:t>Purina Pro Plan Sensitive Skin and Stomach Dog Food Small Breed, Adult Salmon &amp; Rice Formula - 4 lb. Bag</w:t>
+            </w:r>
+          </w:p>
+        </w:tc>
+      </w:tr>
+      <w:tr>
+        <w:tc>
+          <w:tcPr>
+            <w:tcW w:w="4405" w:type="dxa"/>
+          </w:tcPr>
+          <w:p>
+            <w:pPr>
+              <w:rPr>
+                <w:rFonts w:ascii="Arial Narrow" w:hAnsi="Arial Narrow"/>
+                <w:sz w:val="16"/>
+                <w:szCs w:val="16"/>
+              </w:rPr>
+            </w:pPr>
+            <w:r>
+              <w:rPr>
+                <w:rFonts w:ascii="Arial Narrow" w:hAnsi="Arial Narrow"/>
+                <w:sz w:val="16"/>
+                <w:szCs w:val="16"/>
+              </w:rPr>
+              <w:t>https://www.amazon.com/Diamond-Naturals-Recipe-Natural-Caught/dp/B079FHJMMG?c=ts&amp;dib=eyJ2IjoiMSJ9.igPWBRgnpOd0CIQ3UJvpcZAMpRwB_iKwYtQyqn8VAYphzRL3wEUaE7CmwMSNGIDEQTliamkJcUNha3GyuzZV1eP0Bg4N3XuUUGTJzTXQk1VJPQHPWhT-zDXIzrgNi_b6kzSJM0D6KkCEvv4JEvsWYcIn5cKwB20bwrIXjKSCMOG-1WxqCVb5KJBDR2t6RcPD3BVnhSIDKlg_YBejp6iuD9MWQIEF0FCiuqIM_wSlkpofCZFOHvNmJAbUYpkXGJC06OXO2ghz4VDafqPhKqWjKNKmvyIjE3vCcfICtCrmnuU.OTnBx-b2WdBvK7vsN7yr9vYyfVmrsFy2lKxZKQ7vLEc&amp;dib_tag=se&amp;keywords=Dog%2BFood&amp;qid=1775708473&amp;s=pet-supplies&amp;sr=1-24&amp;ts_id=2975359011&amp;th=1&amp;linkCode=ll2&amp;tag=babymydog03-20&amp;linkId=1cc5ca291fd4aa648dd84517fcf19fb2&amp;language=en_US&amp;ref_=as_li_ss_tl</w:t>
+            </w:r>
+          </w:p>
+        </w:tc>
+        <w:tc>
+          <w:tcPr>
+            <w:tcW w:w="4945" w:type="dxa"/>
+          </w:tcPr>
+          <w:p>
+            <w:pPr>
+              <w:rPr>
+                <w:rFonts w:ascii="Arial Narrow" w:hAnsi="Arial Narrow"/>
+                <w:sz w:val="16"/>
+                <w:szCs w:val="16"/>
+              </w:rPr>
+            </w:pPr>
+            <w:r>
+              <w:rPr>
+                <w:rFonts w:ascii="Arial Narrow" w:hAnsi="Arial Narrow"/>
+                <w:sz w:val="16"/>
+                <w:szCs w:val="16"/>
+              </w:rPr>
+              <w:t>Diamond Naturals Skin &amp; Coat Real Salmon and Potato Recipe Dry Dog Food with High Quality Protein, Omega Fatty Acids, Probiotics and Essential Nutrients to Promote Healthy Skin and Coat 30lb</w:t>
+            </w:r>
+          </w:p>
+        </w:tc>
+      </w:tr>
+      <w:tr>
+        <w:tc>
+          <w:tcPr>
+            <w:tcW w:w="4405" w:type="dxa"/>
+          </w:tcPr>
+          <w:p>
+            <w:pPr>
+              <w:rPr>
+                <w:rFonts w:ascii="Arial Narrow" w:hAnsi="Arial Narrow"/>
+                <w:sz w:val="16"/>
+                <w:szCs w:val="16"/>
+              </w:rPr>
+            </w:pPr>
+            <w:r>
+              <w:rPr>
+                <w:rFonts w:ascii="Arial Narrow" w:hAnsi="Arial Narrow"/>
+                <w:sz w:val="16"/>
+                <w:szCs w:val="16"/>
+              </w:rPr>
+              <w:t>https://www.amazon.com/ACANA-Butchers-Favorites-Farm-Raised-Recipe/dp/B0C4M5P94V?c=ts&amp;dib=eyJ2IjoiMSJ9.igPWBRgnpOd0CIQ3UJvpcZAMpRwB_iKwYtQyqn8VAYphzRL3wEUaE7CmwMSNGIDEQTliamkJcUNha3GyuzZV1eP0Bg4N3XuUUGTJzTXQk1VJPQHPWhT-zDXIzrgNi_b6kzSJM0D6KkCEvv4JEvsWYcIn5cKwB20bwrIXjKSCMOG-1WxqCVb5KJBDR2t6RcPD3BVnhSIDKlg_YBejp6iuD9MWQIEF0FCiuqIM_wSlkpofCZFOHvNmJAbUYpkXGJC06OXO2ghz4VDafqPhKqWjKNKmvyIjE3vCcfICtCrmnuU.OTnBx-b2WdBvK7vsN7yr9vYyfVmrsFy2lKxZKQ7vLEc&amp;dib_tag=se&amp;keywords=Dog%2BFood&amp;qid=1775708473&amp;rdc=1&amp;s=pet-supplies&amp;sr=1-25-spons&amp;ts_id=2975359011&amp;sp_csd=d2lkZ2V0TmFtZT1zcF9idGY&amp;th=1&amp;linkCode=ll2&amp;tag=babymydog03-20&amp;linkId=db2903cd2dc96165d8fa13e538ee4b0d&amp;language=en_US&amp;ref_=as_li_ss_tl</w:t>
+            </w:r>
+          </w:p>
+        </w:tc>
+        <w:tc>
+          <w:tcPr>
+            <w:tcW w:w="4945" w:type="dxa"/>
+          </w:tcPr>
+          <w:p>
+            <w:pPr>
+              <w:rPr>
+                <w:rFonts w:ascii="Arial Narrow" w:hAnsi="Arial Narrow"/>
+                <w:sz w:val="16"/>
+                <w:szCs w:val="16"/>
+              </w:rPr>
+            </w:pPr>
+            <w:r>
+              <w:rPr>
+                <w:rFonts w:ascii="Arial Narrow" w:hAnsi="Arial Narrow"/>
+                <w:sz w:val="16"/>
+                <w:szCs w:val="16"/>
+              </w:rPr>
+              <w:t>ACANA Butcher’s Favorites Grain-Free Dry Dog Food Farm-Raised Beef &amp; Liver Recipe 4lb Bag</w:t>
+            </w:r>
+          </w:p>
+        </w:tc>
+      </w:tr>
+      <w:tr>
+        <w:tc>
+          <w:tcPr>
+            <w:tcW w:w="4405" w:type="dxa"/>
+          </w:tcPr>
+          <w:p>
+            <w:pPr>
+              <w:rPr>
+                <w:rFonts w:ascii="Arial Narrow" w:hAnsi="Arial Narrow"/>
+                <w:sz w:val="16"/>
+                <w:szCs w:val="16"/>
+              </w:rPr>
+            </w:pPr>
+            <w:r>
+              <w:rPr>
+                <w:rFonts w:ascii="Arial Narrow" w:hAnsi="Arial Narrow"/>
+                <w:sz w:val="16"/>
+                <w:szCs w:val="16"/>
+              </w:rPr>
+              <w:t>https://www.amazon.com/BADLANDS-RANCH-Katherine-Superfood-Air-Dried/dp/B0CXM85SL7?c=ts&amp;dib=eyJ2IjoiMSJ9.igPWBRgnpOd0CIQ3UJvpcZAMpRwB_iKwYtQyqn8VAYphzRL3wEUaE7CmwMSNGIDEQTliamkJcUNha3GyuzZV1eP0Bg4N3XuUUGTJzTXQk1VJPQHPWhT-zDXIzrgNi_b6kzSJM0D6KkCEvv4JEvsWYcIn5cKwB20bwrIXjKSCMOG-1WxqCVb5KJBDR2t6RcPD3BVnhSIDKlg_YBejp6iuD9MWQIEF0FCiuqIM_wSlkpofCZFOHvNmJAbUYpkXGJC06OXO2ghz4VDafqPhKqWjKNKmvyIjE3vCcfICtCrmnuU.OTnBx-b2WdBvK7vsN7yr9vYyfVmrsFy2lKxZKQ7vLEc&amp;dib_tag=se&amp;keywords=Dog%2BFood&amp;qid=1775708473&amp;s=pet-supplies&amp;sr=1-26-spons&amp;ts_id=2975359011&amp;sp_csd=d2lkZ2V0TmFtZT1zcF9idGY&amp;th=1&amp;linkCode=ll2&amp;tag=babymydog03-20&amp;linkId=5d2224233d84b382abe2b7041283942c&amp;language=en_US&amp;ref_=as_li_ss_tl</w:t>
+            </w:r>
+          </w:p>
+        </w:tc>
+        <w:tc>
+          <w:tcPr>
+            <w:tcW w:w="4945" w:type="dxa"/>
+          </w:tcPr>
+          <w:p>
+            <w:pPr>
+              <w:rPr>
+                <w:rFonts w:ascii="Arial Narrow" w:hAnsi="Arial Narrow"/>
+                <w:sz w:val="16"/>
+                <w:szCs w:val="16"/>
+              </w:rPr>
+            </w:pPr>
+            <w:r>
+              <w:rPr>
+                <w:rFonts w:ascii="Arial Narrow" w:hAnsi="Arial Narrow"/>
+                <w:sz w:val="16"/>
+                <w:szCs w:val="16"/>
+              </w:rPr>
+              <w:t>BADLANDS RANCH by Katherine Heigl – Superfood Complete Air-Dried Beef Dog Food – High Protein with Superfoods for Daily Wellness &amp; Consistent Nutrition – 64 oz</w:t>
+            </w:r>
+          </w:p>
+        </w:tc>
+      </w:tr>
+      <w:tr>
+        <w:tc>
+          <w:tcPr>
+            <w:tcW w:w="4405" w:type="dxa"/>
+          </w:tcPr>
+          <w:p>
+            <w:pPr>
+              <w:rPr>
+                <w:rFonts w:ascii="Arial Narrow" w:hAnsi="Arial Narrow"/>
+                <w:sz w:val="16"/>
+                <w:szCs w:val="16"/>
+              </w:rPr>
+            </w:pPr>
+            <w:r>
+              <w:rPr>
+                <w:rFonts w:ascii="Arial Narrow" w:hAnsi="Arial Narrow"/>
+                <w:sz w:val="16"/>
+                <w:szCs w:val="16"/>
+              </w:rPr>
+              <w:t>https://www.amazon.com/Purina-Smartblend-Natural-Chicken-Formula/dp/B073PCGRR2?c=ts&amp;dib=eyJ2IjoiMSJ9.igPWBRgnpOd0CIQ3UJvpcZAMpRwB_iKwYtQyqn8VAYphzRL3wEUaE7CmwMSNGIDEQTliamkJcUNha3GyuzZV1eP0Bg4N3XuUUGTJzTXQk1VJPQHPWhT-zDXIzrgNi_b6kzSJM0D6KkCEvv4JEvsWYcIn5cKwB20bwrIXjKSCMOG-1WxqCVb5KJBDR2t6RcPD3BVnhSIDKlg_YBejp6iuD9MWQIEF0FCiuqIM_wSlkpofCZFOHvNmJAbUYpkXGJC06OXO2ghz4VDafqPhKqWjKNKmvyIjE3vCcfICtCrmnuU.OTnBx-b2WdBvK7vsN7yr9vYyfVmrsFy2lKxZKQ7vLEc&amp;dib_tag=se&amp;keywords=Dog%2BFood&amp;qid=1775708473&amp;rdc=1&amp;s=pet-supplies&amp;sr=1-27-spons&amp;ts_id=2975359011&amp;sp_csd=d2lkZ2V0TmFtZT1zcF9idGY&amp;th=1&amp;linkCode=ll2&amp;tag=babymydog03-20&amp;linkId=5d9fa9942c2495a7e91486330a53cb26&amp;language=en_US&amp;ref_=as_li_ss_tl</w:t>
+            </w:r>
+          </w:p>
+        </w:tc>
+        <w:tc>
+          <w:tcPr>
+            <w:tcW w:w="4945" w:type="dxa"/>
+          </w:tcPr>
+          <w:p>
+            <w:pPr>
+              <w:rPr>
+                <w:rFonts w:ascii="Arial Narrow" w:hAnsi="Arial Narrow"/>
+                <w:sz w:val="16"/>
+                <w:szCs w:val="16"/>
+              </w:rPr>
+            </w:pPr>
+            <w:r>
+              <w:rPr>
+                <w:rFonts w:ascii="Arial Narrow" w:hAnsi="Arial Narrow"/>
+                <w:sz w:val="16"/>
+                <w:szCs w:val="16"/>
+              </w:rPr>
+              <w:t>Purina ONE Chicken and Rice Formula Dry Dog Food - 40 lb. Bag</w:t>
+            </w:r>
+          </w:p>
+        </w:tc>
+      </w:tr>
+      <w:tr>
+        <w:tc>
+          <w:tcPr>
+            <w:tcW w:w="4405" w:type="dxa"/>
+          </w:tcPr>
+          <w:p>
+            <w:pPr>
+              <w:rPr>
+                <w:rFonts w:ascii="Arial Narrow" w:hAnsi="Arial Narrow"/>
+                <w:sz w:val="16"/>
+                <w:szCs w:val="16"/>
+              </w:rPr>
+            </w:pPr>
+          </w:p>
+        </w:tc>
+        <w:tc>
+          <w:tcPr>
+            <w:tcW w:w="4945" w:type="dxa"/>
+          </w:tcPr>
+          <w:p>
+            <w:pPr>
+              <w:rPr>
+                <w:rFonts w:ascii="Arial Narrow" w:hAnsi="Arial Narrow"/>
+                <w:sz w:val="16"/>
+                <w:szCs w:val="16"/>
+              </w:rPr>
+            </w:pPr>
+          </w:p>
+        </w:tc>
+      </w:tr>
+      <w:tr>
+        <w:tc>
+          <w:tcPr>
+            <w:tcW w:w="4405" w:type="dxa"/>
+          </w:tcPr>
+          <w:p>
+            <w:pPr>
+              <w:rPr>
+                <w:rFonts w:ascii="Arial Narrow" w:hAnsi="Arial Narrow"/>
+                <w:sz w:val="16"/>
+                <w:szCs w:val="16"/>
+              </w:rPr>
+            </w:pPr>
+          </w:p>
+        </w:tc>
+        <w:tc>
+          <w:tcPr>
+            <w:tcW w:w="4945" w:type="dxa"/>
+          </w:tcPr>
+          <w:p>
+            <w:pPr>
+              <w:rPr>
+                <w:rFonts w:ascii="Arial Narrow" w:hAnsi="Arial Narrow"/>
+                <w:sz w:val="16"/>
+                <w:szCs w:val="16"/>
+              </w:rPr>
+            </w:pPr>
+          </w:p>
+        </w:tc>
+      </w:tr>
+      <w:tr>
+        <w:tc>
+          <w:tcPr>
+            <w:tcW w:w="4405" w:type="dxa"/>
+          </w:tcPr>
+          <w:p>
+            <w:pPr>
+              <w:rPr>
+                <w:rFonts w:ascii="Arial Narrow" w:hAnsi="Arial Narrow"/>
+                <w:sz w:val="16"/>
+                <w:szCs w:val="16"/>
+              </w:rPr>
+            </w:pPr>
+          </w:p>
+        </w:tc>
+        <w:tc>
+          <w:tcPr>
+            <w:tcW w:w="4945" w:type="dxa"/>
+          </w:tcPr>
+          <w:p>
+            <w:pPr>
+              <w:rPr>
+                <w:rFonts w:ascii="Arial Narrow" w:hAnsi="Arial Narrow"/>
+                <w:sz w:val="16"/>
+                <w:szCs w:val="16"/>
+              </w:rPr>
+            </w:pPr>
+          </w:p>
+        </w:tc>
+      </w:tr>
+      <w:tr>
+        <w:tc>
+          <w:tcPr>
+            <w:tcW w:w="4405" w:type="dxa"/>
+          </w:tcPr>
+          <w:p>
+            <w:pPr>
+              <w:rPr>
+                <w:rFonts w:ascii="Arial Narrow" w:hAnsi="Arial Narrow"/>
+                <w:sz w:val="16"/>
+                <w:szCs w:val="16"/>
+              </w:rPr>
+            </w:pPr>
+          </w:p>
+        </w:tc>
+        <w:tc>
+          <w:tcPr>
+            <w:tcW w:w="4945" w:type="dxa"/>
+          </w:tcPr>
+          <w:p>
+            <w:pPr>
+              <w:rPr>
+                <w:rFonts w:ascii="Arial Narrow" w:hAnsi="Arial Narrow"/>
+                <w:sz w:val="16"/>
+                <w:szCs w:val="16"/>
+              </w:rPr>
+            </w:pPr>
+          </w:p>
+        </w:tc>
+      </w:tr>
+      <w:tr>
+        <w:tc>
+          <w:tcPr>
+            <w:tcW w:w="4405" w:type="dxa"/>
+          </w:tcPr>
+          <w:p>
+            <w:pPr>
+              <w:rPr>
+                <w:rFonts w:ascii="Arial Narrow" w:hAnsi="Arial Narrow"/>
+                <w:sz w:val="16"/>
+                <w:szCs w:val="16"/>
+              </w:rPr>
+            </w:pPr>
+          </w:p>
+        </w:tc>
+        <w:tc>
+          <w:tcPr>
+            <w:tcW w:w="4945" w:type="dxa"/>
+          </w:tcPr>
+          <w:p>
+            <w:pPr>
+              <w:rPr>
+                <w:rFonts w:ascii="Arial Narrow" w:hAnsi="Arial Narrow"/>
+                <w:sz w:val="16"/>
+                <w:szCs w:val="16"/>
+              </w:rPr>
+            </w:pPr>
+          </w:p>
+        </w:tc>
+      </w:tr>
+      <w:tr>
+        <w:tc>
+          <w:tcPr>
+            <w:tcW w:w="4405" w:type="dxa"/>
+          </w:tcPr>
+          <w:p>
+            <w:pPr>
+              <w:rPr>
+                <w:rFonts w:ascii="Arial Narrow" w:hAnsi="Arial Narrow"/>
+                <w:sz w:val="16"/>
+                <w:szCs w:val="16"/>
+              </w:rPr>
+            </w:pPr>
+          </w:p>
+        </w:tc>
+        <w:tc>
+          <w:tcPr>
+            <w:tcW w:w="4945" w:type="dxa"/>
+          </w:tcPr>
+          <w:p>
+            <w:pPr>
+              <w:rPr>
+                <w:rFonts w:ascii="Arial Narrow" w:hAnsi="Arial Narrow"/>
+                <w:sz w:val="16"/>
+                <w:szCs w:val="16"/>
+              </w:rPr>
+            </w:pPr>
+          </w:p>
+        </w:tc>
+      </w:tr>
+      <w:tr>
+        <w:tc>
+          <w:tcPr>
+            <w:tcW w:w="4405" w:type="dxa"/>
+          </w:tcPr>
+          <w:p>
+            <w:pPr>
+              <w:rPr>
+                <w:rFonts w:ascii="Arial Narrow" w:hAnsi="Arial Narrow"/>
+                <w:sz w:val="16"/>
+                <w:szCs w:val="16"/>
+              </w:rPr>
+            </w:pPr>
+          </w:p>
+        </w:tc>
+        <w:tc>
+          <w:tcPr>
+            <w:tcW w:w="4945" w:type="dxa"/>
+          </w:tcPr>
+          <w:p>
+            <w:pPr>
+              <w:rPr>
+                <w:rFonts w:ascii="Arial Narrow" w:hAnsi="Arial Narrow"/>
+                <w:sz w:val="16"/>
+                <w:szCs w:val="16"/>
+              </w:rPr>
+            </w:pPr>
+          </w:p>
+        </w:tc>
+      </w:tr>
+      <w:tr>
+        <w:tc>
+          <w:tcPr>
+            <w:tcW w:w="4405" w:type="dxa"/>
+          </w:tcPr>
+          <w:p>
+            <w:pPr>
+              <w:rPr>
+                <w:rFonts w:ascii="Arial Narrow" w:hAnsi="Arial Narrow"/>
+                <w:sz w:val="16"/>
+                <w:szCs w:val="16"/>
+              </w:rPr>
+            </w:pPr>
+          </w:p>
+        </w:tc>
+        <w:tc>
+          <w:tcPr>
+            <w:tcW w:w="4945" w:type="dxa"/>
+          </w:tcPr>
+          <w:p>
+            <w:pPr>
+              <w:rPr>
+                <w:rFonts w:ascii="Arial Narrow" w:hAnsi="Arial Narrow"/>
+                <w:sz w:val="16"/>
+                <w:szCs w:val="16"/>
+              </w:rPr>
+            </w:pPr>
+          </w:p>
+        </w:tc>
+      </w:tr>
+      <w:tr>
+        <w:tc>
+          <w:tcPr>
+            <w:tcW w:w="4405" w:type="dxa"/>
+          </w:tcPr>
+          <w:p>
+            <w:pPr>
+              <w:rPr>
+                <w:rFonts w:ascii="Arial Narrow" w:hAnsi="Arial Narrow"/>
+                <w:sz w:val="16"/>
+                <w:szCs w:val="16"/>
+              </w:rPr>
+            </w:pPr>
+          </w:p>
+        </w:tc>
+        <w:tc>
+          <w:tcPr>
+            <w:tcW w:w="4945" w:type="dxa"/>
+          </w:tcPr>
+          <w:p>
+            <w:pPr>
+              <w:rPr>
+                <w:rFonts w:ascii="Arial Narrow" w:hAnsi="Arial Narrow"/>
+                <w:sz w:val="16"/>
+                <w:szCs w:val="16"/>
+              </w:rPr>
+            </w:pPr>
+          </w:p>
+        </w:tc>
+      </w:tr>
+      <w:tr>
+        <w:tc>
+          <w:tcPr>
+            <w:tcW w:w="4405" w:type="dxa"/>
+          </w:tcPr>
+          <w:p>
+            <w:pPr>
+              <w:rPr>
+                <w:rFonts w:ascii="Arial Narrow" w:hAnsi="Arial Narrow"/>
+                <w:sz w:val="16"/>
+                <w:szCs w:val="16"/>
+              </w:rPr>
+            </w:pPr>
+          </w:p>
+        </w:tc>
+        <w:tc>
+          <w:tcPr>
+            <w:tcW w:w="4945" w:type="dxa"/>
+          </w:tcPr>
+          <w:p>
+            <w:pPr>
+              <w:rPr>
+                <w:rFonts w:ascii="Arial Narrow" w:hAnsi="Arial Narrow"/>
+                <w:sz w:val="16"/>
+                <w:szCs w:val="16"/>
+              </w:rPr>
+            </w:pPr>
+          </w:p>
+        </w:tc>
+      </w:tr>
+      <w:tr>
+        <w:tc>
+          <w:tcPr>
+            <w:tcW w:w="4405" w:type="dxa"/>
+          </w:tcPr>
+          <w:p>
+            <w:pPr>
+              <w:rPr>
+                <w:rFonts w:ascii="Arial Narrow" w:hAnsi="Arial Narrow"/>
+                <w:sz w:val="16"/>
+                <w:szCs w:val="16"/>
+              </w:rPr>
+            </w:pPr>
+          </w:p>
+        </w:tc>
+        <w:tc>
+          <w:tcPr>
+            <w:tcW w:w="4945" w:type="dxa"/>
+          </w:tcPr>
+          <w:p>
+            <w:pPr>
+              <w:rPr>
+                <w:rFonts w:ascii="Arial Narrow" w:hAnsi="Arial Narrow"/>
+                <w:sz w:val="16"/>
+                <w:szCs w:val="16"/>
+              </w:rPr>
+            </w:pPr>
+          </w:p>
+        </w:tc>
+      </w:tr>
+      <w:tr>
+        <w:tc>
+          <w:tcPr>
+            <w:tcW w:w="4405" w:type="dxa"/>
+          </w:tcPr>
+          <w:p>
+            <w:pPr>
+              <w:rPr>
+                <w:rFonts w:ascii="Arial Narrow" w:hAnsi="Arial Narrow"/>
+                <w:sz w:val="16"/>
+                <w:szCs w:val="16"/>
+              </w:rPr>
+            </w:pPr>
+          </w:p>
+        </w:tc>
+        <w:tc>
+          <w:tcPr>
+            <w:tcW w:w="4945" w:type="dxa"/>
+          </w:tcPr>
+          <w:p>
+            <w:pPr>
+              <w:rPr>
+                <w:rFonts w:ascii="Arial Narrow" w:hAnsi="Arial Narrow"/>
+                <w:sz w:val="16"/>
+                <w:szCs w:val="16"/>
+              </w:rPr>
+            </w:pPr>
+          </w:p>
+        </w:tc>
+      </w:tr>
+      <w:tr>
+        <w:tc>
+          <w:tcPr>
+            <w:tcW w:w="4405" w:type="dxa"/>
+          </w:tcPr>
+          <w:p>
+            <w:pPr>
+              <w:rPr>
+                <w:rFonts w:ascii="Arial Narrow" w:hAnsi="Arial Narrow"/>
+                <w:sz w:val="16"/>
+                <w:szCs w:val="16"/>
+              </w:rPr>
+            </w:pPr>
+          </w:p>
+        </w:tc>
+        <w:tc>
+          <w:tcPr>
+            <w:tcW w:w="4945" w:type="dxa"/>
+          </w:tcPr>
+          <w:p>
+            <w:pPr>
+              <w:rPr>
+                <w:rFonts w:ascii="Arial Narrow" w:hAnsi="Arial Narrow"/>
+                <w:sz w:val="16"/>
+                <w:szCs w:val="16"/>
+              </w:rPr>
+            </w:pPr>
+          </w:p>
+        </w:tc>
+      </w:tr>
+      <w:tr>
+        <w:tc>
+          <w:tcPr>
+            <w:tcW w:w="4405" w:type="dxa"/>
+          </w:tcPr>
+          <w:p>
+            <w:pPr>
+              <w:rPr>
+                <w:rFonts w:ascii="Arial Narrow" w:hAnsi="Arial Narrow"/>
+                <w:sz w:val="16"/>
+                <w:szCs w:val="16"/>
+              </w:rPr>
+            </w:pPr>
+          </w:p>
+        </w:tc>
+        <w:tc>
+          <w:tcPr>
+            <w:tcW w:w="4945" w:type="dxa"/>
+          </w:tcPr>
+          <w:p>
+            <w:pPr>
+              <w:rPr>
+                <w:rFonts w:ascii="Arial Narrow" w:hAnsi="Arial Narrow"/>
+                <w:sz w:val="16"/>
+                <w:szCs w:val="16"/>
+              </w:rPr>
+            </w:pPr>
+          </w:p>
+        </w:tc>
+      </w:tr>
+      <w:tr>
+        <w:tc>
+          <w:tcPr>
+            <w:tcW w:w="4405" w:type="dxa"/>
+          </w:tcPr>
+          <w:p>
+            <w:pPr>
+              <w:rPr>
+                <w:rFonts w:ascii="Arial Narrow" w:hAnsi="Arial Narrow"/>
+                <w:sz w:val="16"/>
+                <w:szCs w:val="16"/>
+              </w:rPr>
+            </w:pPr>
+          </w:p>
+        </w:tc>
+        <w:tc>
+          <w:tcPr>
+            <w:tcW w:w="4945" w:type="dxa"/>
+          </w:tcPr>
+          <w:p>
+            <w:pPr>
+              <w:rPr>
+                <w:rFonts w:ascii="Arial Narrow" w:hAnsi="Arial Narrow"/>
+                <w:sz w:val="16"/>
+                <w:szCs w:val="16"/>
+              </w:rPr>
+            </w:pPr>
+          </w:p>
+        </w:tc>
+      </w:tr>
+      <w:tr>
+        <w:tc>
+          <w:tcPr>
+            <w:tcW w:w="4405" w:type="dxa"/>
+          </w:tcPr>
+          <w:p>
+            <w:pPr>
+              <w:rPr>
+                <w:rFonts w:ascii="Arial Narrow" w:hAnsi="Arial Narrow"/>
+                <w:sz w:val="16"/>
+                <w:szCs w:val="16"/>
+              </w:rPr>
+            </w:pPr>
+          </w:p>
+        </w:tc>
+        <w:tc>
+          <w:tcPr>
+            <w:tcW w:w="4945" w:type="dxa"/>
+          </w:tcPr>
+          <w:p>
+            <w:pPr>
+              <w:rPr>
+                <w:rFonts w:ascii="Arial Narrow" w:hAnsi="Arial Narrow"/>
+                <w:sz w:val="16"/>
+                <w:szCs w:val="16"/>
+              </w:rPr>
+            </w:pPr>
+          </w:p>
+        </w:tc>
+      </w:tr>
+      <w:tr>
+        <w:tc>
+          <w:tcPr>
+            <w:tcW w:w="4405" w:type="dxa"/>
+          </w:tcPr>
+          <w:p>
+            <w:pPr>
+              <w:rPr>
+                <w:rFonts w:ascii="Arial Narrow" w:hAnsi="Arial Narrow"/>
+                <w:sz w:val="16"/>
+                <w:szCs w:val="16"/>
+              </w:rPr>
+            </w:pPr>
+          </w:p>
+        </w:tc>
+        <w:tc>
+          <w:tcPr>
+            <w:tcW w:w="4945" w:type="dxa"/>
+          </w:tcPr>
+          <w:p>
+            <w:pPr>
+              <w:rPr>
+                <w:rFonts w:ascii="Arial Narrow" w:hAnsi="Arial Narrow"/>
+                <w:sz w:val="16"/>
+                <w:szCs w:val="16"/>
+              </w:rPr>
+            </w:pPr>
+          </w:p>
+        </w:tc>
+      </w:tr>
+      <w:tr>
+        <w:tc>
+          <w:tcPr>
+            <w:tcW w:w="4405" w:type="dxa"/>
+          </w:tcPr>
+          <w:p>
+            <w:pPr>
+              <w:rPr>
+                <w:rFonts w:ascii="Arial Narrow" w:hAnsi="Arial Narrow"/>
+                <w:sz w:val="16"/>
+                <w:szCs w:val="16"/>
+              </w:rPr>
+            </w:pPr>
+          </w:p>
+        </w:tc>
+        <w:tc>
+          <w:tcPr>
+            <w:tcW w:w="4945" w:type="dxa"/>
+          </w:tcPr>
+          <w:p>
+            <w:pPr>
+              <w:rPr>
+                <w:rFonts w:ascii="Arial Narrow" w:hAnsi="Arial Narrow"/>
+                <w:sz w:val="16"/>
+                <w:szCs w:val="16"/>
+              </w:rPr>
+            </w:pPr>
+          </w:p>
+        </w:tc>
+      </w:tr>
+      <w:tr>
+        <w:tc>
+          <w:tcPr>
+            <w:tcW w:w="4405" w:type="dxa"/>
+          </w:tcPr>
+          <w:p>
+            <w:pPr>
+              <w:rPr>
+                <w:rFonts w:ascii="Arial Narrow" w:hAnsi="Arial Narrow"/>
+                <w:sz w:val="16"/>
+                <w:szCs w:val="16"/>
+              </w:rPr>
+            </w:pPr>
+          </w:p>
+        </w:tc>
+        <w:tc>
+          <w:tcPr>
+            <w:tcW w:w="4945" w:type="dxa"/>
+          </w:tcPr>
+          <w:p>
+            <w:pPr>
+              <w:rPr>
+                <w:rFonts w:ascii="Arial Narrow" w:hAnsi="Arial Narrow"/>
+                <w:sz w:val="16"/>
+                <w:szCs w:val="16"/>
+              </w:rPr>
+            </w:pPr>
+          </w:p>
+        </w:tc>
+      </w:tr>
+      <w:tr>
+        <w:tc>
+          <w:tcPr>
+            <w:tcW w:w="4405" w:type="dxa"/>
+          </w:tcPr>
+          <w:p>
+            <w:pPr>
+              <w:rPr>
+                <w:rFonts w:ascii="Arial Narrow" w:hAnsi="Arial Narrow"/>
+                <w:sz w:val="16"/>
+                <w:szCs w:val="16"/>
+              </w:rPr>
+            </w:pPr>
+          </w:p>
+        </w:tc>
+        <w:tc>
+          <w:tcPr>
+            <w:tcW w:w="4945" w:type="dxa"/>
+          </w:tcPr>
+          <w:p>
+            <w:pPr>
+              <w:rPr>
+                <w:rFonts w:ascii="Arial Narrow" w:hAnsi="Arial Narrow"/>
+                <w:sz w:val="16"/>
+                <w:szCs w:val="16"/>
+              </w:rPr>
+            </w:pPr>
+          </w:p>
+        </w:tc>
+      </w:tr>
+      <w:tr>
+        <w:tc>
+          <w:tcPr>
+            <w:tcW w:w="4405" w:type="dxa"/>
+          </w:tcPr>
+          <w:p>
+            <w:pPr>
+              <w:rPr>
+                <w:rFonts w:ascii="Arial Narrow" w:hAnsi="Arial Narrow"/>
+                <w:sz w:val="16"/>
+                <w:szCs w:val="16"/>
+              </w:rPr>
+            </w:pPr>
+          </w:p>
+        </w:tc>
+        <w:tc>
+          <w:tcPr>
+            <w:tcW w:w="4945" w:type="dxa"/>
+          </w:tcPr>
+          <w:p>
+            <w:pPr>
+              <w:rPr>
+                <w:rFonts w:ascii="Arial Narrow" w:hAnsi="Arial Narrow"/>
+                <w:sz w:val="16"/>
+                <w:szCs w:val="16"/>
+              </w:rPr>
+            </w:pPr>
+          </w:p>
+        </w:tc>
+      </w:tr>
+      <w:tr>
+        <w:tc>
+          <w:tcPr>
+            <w:tcW w:w="4405" w:type="dxa"/>
+          </w:tcPr>
+          <w:p>
+            <w:pPr>
+              <w:rPr>
+                <w:rFonts w:ascii="Arial Narrow" w:hAnsi="Arial Narrow"/>
+                <w:sz w:val="16"/>
+                <w:szCs w:val="16"/>
+              </w:rPr>
+            </w:pPr>
+          </w:p>
+        </w:tc>
+        <w:tc>
+          <w:tcPr>
+            <w:tcW w:w="4945" w:type="dxa"/>
+          </w:tcPr>
+          <w:p>
+            <w:pPr>
+              <w:rPr>
+                <w:rFonts w:ascii="Arial Narrow" w:hAnsi="Arial Narrow"/>
+                <w:sz w:val="16"/>
+                <w:szCs w:val="16"/>
+              </w:rPr>
+            </w:pPr>
+          </w:p>
+        </w:tc>
+      </w:tr>
+      <w:tr>
+        <w:tc>
+          <w:tcPr>
+            <w:tcW w:w="4405" w:type="dxa"/>
+          </w:tcPr>
+          <w:p>
+            <w:pPr>
+              <w:rPr>
+                <w:rFonts w:ascii="Arial Narrow" w:hAnsi="Arial Narrow"/>
+                <w:sz w:val="16"/>
+                <w:szCs w:val="16"/>
+              </w:rPr>
+            </w:pPr>
+          </w:p>
+        </w:tc>
+        <w:tc>
+          <w:tcPr>
+            <w:tcW w:w="4945" w:type="dxa"/>
+          </w:tcPr>
+          <w:p>
+            <w:pPr>
+              <w:rPr>
+                <w:rFonts w:ascii="Arial Narrow" w:hAnsi="Arial Narrow"/>
+                <w:sz w:val="16"/>
+                <w:szCs w:val="16"/>
+              </w:rPr>
+            </w:pPr>
+          </w:p>
+        </w:tc>
+      </w:tr>
+      <w:tr>
+        <w:tc>
+          <w:tcPr>
+            <w:tcW w:w="4405" w:type="dxa"/>
+          </w:tcPr>
+          <w:p>
+            <w:pPr>
+              <w:rPr>
+                <w:rFonts w:ascii="Arial Narrow" w:hAnsi="Arial Narrow"/>
+                <w:sz w:val="16"/>
+                <w:szCs w:val="16"/>
+              </w:rPr>
+            </w:pPr>
+          </w:p>
+        </w:tc>
+        <w:tc>
+          <w:tcPr>
+            <w:tcW w:w="4945" w:type="dxa"/>
+          </w:tcPr>
+          <w:p>
+            <w:pPr>
+              <w:rPr>
+                <w:rFonts w:ascii="Arial Narrow" w:hAnsi="Arial Narrow"/>
+                <w:sz w:val="16"/>
+                <w:szCs w:val="16"/>
+              </w:rPr>
+            </w:pPr>
+          </w:p>
+        </w:tc>
+      </w:tr>
+      <w:tr>
+        <w:tc>
+          <w:tcPr>
+            <w:tcW w:w="4405" w:type="dxa"/>
+          </w:tcPr>
+          <w:p>
+            <w:pPr>
+              <w:rPr>
+                <w:rFonts w:ascii="Arial Narrow" w:hAnsi="Arial Narrow"/>
+                <w:sz w:val="16"/>
+                <w:szCs w:val="16"/>
+              </w:rPr>
+            </w:pPr>
+          </w:p>
+        </w:tc>
+        <w:tc>
+          <w:tcPr>
+            <w:tcW w:w="4945" w:type="dxa"/>
+          </w:tcPr>
+          <w:p>
+            <w:pPr>
+              <w:rPr>
+                <w:rFonts w:ascii="Arial Narrow" w:hAnsi="Arial Narrow"/>
+                <w:sz w:val="16"/>
+                <w:szCs w:val="16"/>
+              </w:rPr>
+            </w:pPr>
+          </w:p>
+        </w:tc>
+      </w:tr>
+      <w:tr>
+        <w:tc>
+          <w:tcPr>
+            <w:tcW w:w="4405" w:type="dxa"/>
+          </w:tcPr>
+          <w:p>
+            <w:pPr>
+              <w:rPr>
+                <w:rFonts w:ascii="Arial Narrow" w:hAnsi="Arial Narrow"/>
+                <w:sz w:val="16"/>
+                <w:szCs w:val="16"/>
+              </w:rPr>
+            </w:pPr>
+          </w:p>
+        </w:tc>
+        <w:tc>
+          <w:tcPr>
+            <w:tcW w:w="4945" w:type="dxa"/>
+          </w:tcPr>
+          <w:p>
+            <w:pPr>
+              <w:rPr>
+                <w:rFonts w:ascii="Arial Narrow" w:hAnsi="Arial Narrow"/>
+                <w:sz w:val="16"/>
+                <w:szCs w:val="16"/>
+              </w:rPr>
+            </w:pPr>
+          </w:p>
+        </w:tc>
+      </w:tr>
+      <w:tr>
+        <w:tc>
+          <w:tcPr>
+            <w:tcW w:w="4405" w:type="dxa"/>
+          </w:tcPr>
+          <w:p>
+            <w:pPr>
+              <w:rPr>
+                <w:rFonts w:ascii="Arial Narrow" w:hAnsi="Arial Narrow"/>
+                <w:sz w:val="16"/>
+                <w:szCs w:val="16"/>
+              </w:rPr>
+            </w:pPr>
+          </w:p>
+        </w:tc>
+        <w:tc>
+          <w:tcPr>
+            <w:tcW w:w="4945" w:type="dxa"/>
+          </w:tcPr>
+          <w:p>
+            <w:pPr>
+              <w:rPr>
+                <w:rFonts w:ascii="Arial Narrow" w:hAnsi="Arial Narrow"/>
+                <w:sz w:val="16"/>
+                <w:szCs w:val="16"/>
+              </w:rPr>
+            </w:pPr>
+          </w:p>
+        </w:tc>
+      </w:tr>
+      <w:tr>
+        <w:tc>
+          <w:tcPr>
+            <w:tcW w:w="4405" w:type="dxa"/>
+          </w:tcPr>
+          <w:p>
+            <w:pPr>
+              <w:rPr>
+                <w:rFonts w:ascii="Arial Narrow" w:hAnsi="Arial Narrow"/>
+                <w:sz w:val="16"/>
+                <w:szCs w:val="16"/>
+              </w:rPr>
+            </w:pPr>
+          </w:p>
+        </w:tc>
+        <w:tc>
+          <w:tcPr>
+            <w:tcW w:w="4945" w:type="dxa"/>
+          </w:tcPr>
+          <w:p>
+            <w:pPr>
+              <w:rPr>
+                <w:rFonts w:ascii="Arial Narrow" w:hAnsi="Arial Narrow"/>
+                <w:sz w:val="16"/>
+                <w:szCs w:val="16"/>
+              </w:rPr>
+            </w:pPr>
+          </w:p>
+        </w:tc>
+      </w:tr>
+      <w:tr>
+        <w:tc>
+          <w:tcPr>
+            <w:tcW w:w="4405" w:type="dxa"/>
+          </w:tcPr>
+          <w:p>
+            <w:pPr>
+              <w:rPr>
+                <w:rFonts w:ascii="Arial Narrow" w:hAnsi="Arial Narrow"/>
+                <w:sz w:val="16"/>
+                <w:szCs w:val="16"/>
+              </w:rPr>
+            </w:pPr>
+          </w:p>
+        </w:tc>
+        <w:tc>
+          <w:tcPr>
+            <w:tcW w:w="4945" w:type="dxa"/>
+          </w:tcPr>
+          <w:p>
+            <w:pPr>
+              <w:rPr>
+                <w:rFonts w:ascii="Arial Narrow" w:hAnsi="Arial Narrow"/>
+                <w:sz w:val="16"/>
+                <w:szCs w:val="16"/>
+              </w:rPr>
+            </w:pPr>
+          </w:p>
+        </w:tc>
+      </w:tr>
+      <w:tr>
+        <w:tc>
+          <w:tcPr>
+            <w:tcW w:w="4405" w:type="dxa"/>
+          </w:tcPr>
+          <w:p>
+            <w:pPr>
+              <w:rPr>
+                <w:rFonts w:ascii="Arial Narrow" w:hAnsi="Arial Narrow"/>
+                <w:sz w:val="16"/>
+                <w:szCs w:val="16"/>
+              </w:rPr>
+            </w:pPr>
+          </w:p>
+        </w:tc>
+        <w:tc>
+          <w:tcPr>
+            <w:tcW w:w="4945" w:type="dxa"/>
+          </w:tcPr>
+          <w:p>
+            <w:pPr>
+              <w:rPr>
+                <w:rFonts w:ascii="Arial Narrow" w:hAnsi="Arial Narrow"/>
+                <w:sz w:val="16"/>
+                <w:szCs w:val="16"/>
+              </w:rPr>
+            </w:pPr>
+          </w:p>
+        </w:tc>
+      </w:tr>
+      <w:tr>
+        <w:tc>
+          <w:tcPr>
+            <w:tcW w:w="4405" w:type="dxa"/>
+          </w:tcPr>
+          <w:p>
+            <w:pPr>
+              <w:rPr>
+                <w:rFonts w:ascii="Arial Narrow" w:hAnsi="Arial Narrow"/>
+                <w:sz w:val="16"/>
+                <w:szCs w:val="16"/>
+              </w:rPr>
+            </w:pPr>
+          </w:p>
+        </w:tc>
+        <w:tc>
+          <w:tcPr>
+            <w:tcW w:w="4945" w:type="dxa"/>
+          </w:tcPr>
+          <w:p>
+            <w:pPr>
+              <w:rPr>
+                <w:rFonts w:ascii="Arial Narrow" w:hAnsi="Arial Narrow"/>
+                <w:sz w:val="16"/>
+                <w:szCs w:val="16"/>
+              </w:rPr>
+            </w:pPr>
+          </w:p>
+        </w:tc>
+      </w:tr>
+      <w:tr>
+        <w:tc>
+          <w:tcPr>
+            <w:tcW w:w="4405" w:type="dxa"/>
+          </w:tcPr>
+          <w:p>
+            <w:pPr>
+              <w:rPr>
+                <w:rFonts w:ascii="Arial Narrow" w:hAnsi="Arial Narrow"/>
+                <w:sz w:val="16"/>
+                <w:szCs w:val="16"/>
+              </w:rPr>
+            </w:pPr>
+          </w:p>
+        </w:tc>
+        <w:tc>
+          <w:tcPr>
+            <w:tcW w:w="4945" w:type="dxa"/>
+          </w:tcPr>
+          <w:p>
+            <w:pPr>
+              <w:rPr>
+                <w:rFonts w:ascii="Arial Narrow" w:hAnsi="Arial Narrow"/>
+                <w:sz w:val="16"/>
+                <w:szCs w:val="16"/>
+              </w:rPr>
+            </w:pPr>
+          </w:p>
+        </w:tc>
+      </w:tr>
+      <w:tr>
+        <w:tc>
+          <w:tcPr>
+            <w:tcW w:w="4405" w:type="dxa"/>
+          </w:tcPr>
+          <w:p>
+            <w:pPr>
+              <w:rPr>
+                <w:rFonts w:ascii="Arial Narrow" w:hAnsi="Arial Narrow"/>
+                <w:sz w:val="16"/>
+                <w:szCs w:val="16"/>
+              </w:rPr>
+            </w:pPr>
+          </w:p>
+        </w:tc>
+        <w:tc>
+          <w:tcPr>
+            <w:tcW w:w="4945" w:type="dxa"/>
+          </w:tcPr>
+          <w:p>
+            <w:pPr>
+              <w:rPr>
+                <w:rFonts w:ascii="Arial Narrow" w:hAnsi="Arial Narrow"/>
+                <w:sz w:val="16"/>
+                <w:szCs w:val="16"/>
+              </w:rPr>
+            </w:pPr>
           </w:p>
         </w:tc>
       </w:tr>

</xml_diff>